<commit_message>
update for dynamic form reports
</commit_message>
<xml_diff>
--- a/src/service/sectionParts/util/locationGeneration/Deck2AllData_Generic.docx
+++ b/src/service/sectionParts/util/locationGeneration/Deck2AllData_Generic.docx
@@ -1,6 +1,6 @@
 
 <file path=word/document.xml><?xml version="1.0" encoding="utf-8"?>
-<w:document xmlns:wpc="http://schemas.microsoft.com/office/word/2010/wordprocessingCanvas" xmlns:cx="http://schemas.microsoft.com/office/drawing/2014/chartex" xmlns:cx1="http://schemas.microsoft.com/office/drawing/2015/9/8/chartex" xmlns:cx2="http://schemas.microsoft.com/office/drawing/2015/10/21/chartex" xmlns:cx3="http://schemas.microsoft.com/office/drawing/2016/5/9/chartex" xmlns:cx4="http://schemas.microsoft.com/office/drawing/2016/5/10/chartex" xmlns:cx5="http://schemas.microsoft.com/office/drawing/2016/5/11/chartex" xmlns:cx6="http://schemas.microsoft.com/office/drawing/2016/5/12/chartex" xmlns:cx7="http://schemas.microsoft.com/office/drawing/2016/5/13/chartex" xmlns:cx8="http://schemas.microsoft.com/office/drawing/2016/5/14/chartex" xmlns:mc="http://schemas.openxmlformats.org/markup-compatibility/2006" xmlns:aink="http://schemas.microsoft.com/office/drawing/2016/ink" xmlns:am3d="http://schemas.microsoft.com/office/drawing/2017/model3d" xmlns:o="urn:schemas-microsoft-com:office:office" xmlns:oel="http://schemas.microsoft.com/office/2019/extlst" xmlns:r="http://schemas.openxmlformats.org/officeDocument/2006/relationships" xmlns:m="http://schemas.openxmlformats.org/officeDocument/2006/math" xmlns:v="urn:schemas-microsoft-com:vml" xmlns:wp14="http://schemas.microsoft.com/office/word/2010/wordprocessingDrawing" xmlns:wp="http://schemas.openxmlformats.org/drawingml/2006/wordprocessingDrawing" xmlns:w10="urn:schemas-microsoft-com:office:word" xmlns:w="http://schemas.openxmlformats.org/wordprocessingml/2006/main" xmlns:w14="http://schemas.microsoft.com/office/word/2010/wordml" xmlns:w15="http://schemas.microsoft.com/office/word/2012/wordml" xmlns:w16cex="http://schemas.microsoft.com/office/word/2018/wordml/cex" xmlns:w16cid="http://schemas.microsoft.com/office/word/2016/wordml/cid" xmlns:w16="http://schemas.microsoft.com/office/word/2018/wordml" xmlns:w16sdtdh="http://schemas.microsoft.com/office/word/2020/wordml/sdtdatahash" xmlns:w16se="http://schemas.microsoft.com/office/word/2015/wordml/symex" xmlns:wpg="http://schemas.microsoft.com/office/word/2010/wordprocessingGroup" xmlns:wpi="http://schemas.microsoft.com/office/word/2010/wordprocessingInk" xmlns:wne="http://schemas.microsoft.com/office/word/2006/wordml" xmlns:wps="http://schemas.microsoft.com/office/word/2010/wordprocessingShape" mc:Ignorable="w14 w15 w16se w16cid w16 w16cex w16sdtdh wp14">
+<w:document xmlns:wpc="http://schemas.microsoft.com/office/word/2010/wordprocessingCanvas" xmlns:cx="http://schemas.microsoft.com/office/drawing/2014/chartex" xmlns:cx1="http://schemas.microsoft.com/office/drawing/2015/9/8/chartex" xmlns:cx2="http://schemas.microsoft.com/office/drawing/2015/10/21/chartex" xmlns:cx3="http://schemas.microsoft.com/office/drawing/2016/5/9/chartex" xmlns:cx4="http://schemas.microsoft.com/office/drawing/2016/5/10/chartex" xmlns:cx5="http://schemas.microsoft.com/office/drawing/2016/5/11/chartex" xmlns:cx6="http://schemas.microsoft.com/office/drawing/2016/5/12/chartex" xmlns:cx7="http://schemas.microsoft.com/office/drawing/2016/5/13/chartex" xmlns:cx8="http://schemas.microsoft.com/office/drawing/2016/5/14/chartex" xmlns:mc="http://schemas.openxmlformats.org/markup-compatibility/2006" xmlns:aink="http://schemas.microsoft.com/office/drawing/2016/ink" xmlns:am3d="http://schemas.microsoft.com/office/drawing/2017/model3d" xmlns:o="urn:schemas-microsoft-com:office:office" xmlns:oel="http://schemas.microsoft.com/office/2019/extlst" xmlns:r="http://schemas.openxmlformats.org/officeDocument/2006/relationships" xmlns:m="http://schemas.openxmlformats.org/officeDocument/2006/math" xmlns:v="urn:schemas-microsoft-com:vml" xmlns:wp14="http://schemas.microsoft.com/office/word/2010/wordprocessingDrawing" xmlns:wp="http://schemas.openxmlformats.org/drawingml/2006/wordprocessingDrawing" xmlns:w10="urn:schemas-microsoft-com:office:word" xmlns:w="http://schemas.openxmlformats.org/wordprocessingml/2006/main" xmlns:w14="http://schemas.microsoft.com/office/word/2010/wordml" xmlns:w15="http://schemas.microsoft.com/office/word/2012/wordml" xmlns:w16cex="http://schemas.microsoft.com/office/word/2018/wordml/cex" xmlns:w16cid="http://schemas.microsoft.com/office/word/2016/wordml/cid" xmlns:w16="http://schemas.microsoft.com/office/word/2018/wordml" xmlns:w16du="http://schemas.microsoft.com/office/word/2023/wordml/word16du" xmlns:w16sdtdh="http://schemas.microsoft.com/office/word/2020/wordml/sdtdatahash" xmlns:w16sdtfl="http://schemas.microsoft.com/office/word/2024/wordml/sdtformatlock" xmlns:w16se="http://schemas.microsoft.com/office/word/2015/wordml/symex" xmlns:wpg="http://schemas.microsoft.com/office/word/2010/wordprocessingGroup" xmlns:wpi="http://schemas.microsoft.com/office/word/2010/wordprocessingInk" xmlns:wne="http://schemas.microsoft.com/office/word/2006/wordml" xmlns:wps="http://schemas.microsoft.com/office/word/2010/wordprocessingShape" mc:Ignorable="w14 w15 w16se w16cid w16 w16cex w16sdtdh w16sdtfl w16du wp14">
   <w:body>
     <w:p>
       <w:pPr>
@@ -776,6 +776,7 @@
               </w:rPr>
               <w:t>Yes</w:t>
             </w:r>
+            <w:bookmarkStart w:id="17" w:name="OLE_LINK1"/>
             <w:r>
               <w:rPr>
                 <w:rFonts w:ascii="Nunito" w:eastAsia="Nunito" w:hAnsi="Nunito" w:cs="Nunito"/>
@@ -784,7 +785,18 @@
                 <w:color w:val="FF0000"/>
                 <w:sz w:val="21"/>
               </w:rPr>
-              <w:t>'+++</w:t>
+              <w:t>'</w:t>
+            </w:r>
+            <w:bookmarkEnd w:id="17"/>
+            <w:r>
+              <w:rPr>
+                <w:rFonts w:ascii="Nunito" w:eastAsia="Nunito" w:hAnsi="Nunito" w:cs="Nunito"/>
+                <w:b/>
+                <w:bCs/>
+                <w:color w:val="FF0000"/>
+                <w:sz w:val="21"/>
+              </w:rPr>
+              <w:t>+++</w:t>
             </w:r>
           </w:p>
           <w:p>
@@ -1323,7 +1335,57 @@
                 <w:color w:val="2F4F4F"/>
                 <w:sz w:val="18"/>
               </w:rPr>
-              <w:t>===’checkbox’+++</w:t>
+              <w:t>===</w:t>
+            </w:r>
+            <w:r>
+              <w:rPr>
+                <w:rFonts w:ascii="Nunito" w:eastAsia="Nunito" w:hAnsi="Nunito" w:cs="Nunito"/>
+                <w:b/>
+                <w:bCs/>
+                <w:color w:val="2F4F4F"/>
+                <w:sz w:val="18"/>
+              </w:rPr>
+              <w:t xml:space="preserve"> </w:t>
+            </w:r>
+            <w:r>
+              <w:rPr>
+                <w:rFonts w:ascii="Nunito" w:eastAsia="Nunito" w:hAnsi="Nunito" w:cs="Nunito"/>
+                <w:b/>
+                <w:bCs/>
+                <w:color w:val="FF0000"/>
+                <w:sz w:val="21"/>
+              </w:rPr>
+              <w:t>'</w:t>
+            </w:r>
+            <w:r>
+              <w:rPr>
+                <w:rFonts w:ascii="Nunito" w:eastAsia="Nunito" w:hAnsi="Nunito" w:cs="Nunito"/>
+                <w:b/>
+                <w:bCs/>
+                <w:color w:val="2F4F4F"/>
+                <w:sz w:val="18"/>
+              </w:rPr>
+              <w:t>checkbox</w:t>
+            </w:r>
+            <w:r>
+              <w:rPr>
+                <w:rFonts w:ascii="Nunito" w:eastAsia="Nunito" w:hAnsi="Nunito" w:cs="Nunito"/>
+                <w:b/>
+                <w:bCs/>
+                <w:color w:val="FF0000"/>
+                <w:sz w:val="21"/>
+              </w:rPr>
+              <w:t>'</w:t>
+            </w:r>
+            <w:r>
+              <w:rPr>
+                <w:rFonts w:ascii="Nunito" w:eastAsia="Nunito" w:hAnsi="Nunito" w:cs="Nunito"/>
+                <w:b/>
+                <w:bCs/>
+                <w:color w:val="2F4F4F"/>
+                <w:sz w:val="18"/>
+              </w:rPr>
+              <w:t>+++</w:t>
             </w:r>
           </w:p>
           <w:p>
@@ -1477,7 +1539,57 @@
                 <w:color w:val="2F4F4F"/>
                 <w:sz w:val="18"/>
               </w:rPr>
-              <w:t>!=’checkbox’+++</w:t>
+              <w:t>!=</w:t>
+            </w:r>
+            <w:r>
+              <w:rPr>
+                <w:rFonts w:ascii="Nunito" w:eastAsia="Nunito" w:hAnsi="Nunito" w:cs="Nunito"/>
+                <w:b/>
+                <w:bCs/>
+                <w:color w:val="2F4F4F"/>
+                <w:sz w:val="18"/>
+              </w:rPr>
+              <w:t xml:space="preserve"> </w:t>
+            </w:r>
+            <w:r>
+              <w:rPr>
+                <w:rFonts w:ascii="Nunito" w:eastAsia="Nunito" w:hAnsi="Nunito" w:cs="Nunito"/>
+                <w:b/>
+                <w:bCs/>
+                <w:color w:val="FF0000"/>
+                <w:sz w:val="21"/>
+              </w:rPr>
+              <w:t>'</w:t>
+            </w:r>
+            <w:r>
+              <w:rPr>
+                <w:rFonts w:ascii="Nunito" w:eastAsia="Nunito" w:hAnsi="Nunito" w:cs="Nunito"/>
+                <w:b/>
+                <w:bCs/>
+                <w:color w:val="2F4F4F"/>
+                <w:sz w:val="18"/>
+              </w:rPr>
+              <w:t>checkbox</w:t>
+            </w:r>
+            <w:r>
+              <w:rPr>
+                <w:rFonts w:ascii="Nunito" w:eastAsia="Nunito" w:hAnsi="Nunito" w:cs="Nunito"/>
+                <w:b/>
+                <w:bCs/>
+                <w:color w:val="FF0000"/>
+                <w:sz w:val="21"/>
+              </w:rPr>
+              <w:t>'</w:t>
+            </w:r>
+            <w:r>
+              <w:rPr>
+                <w:rFonts w:ascii="Nunito" w:eastAsia="Nunito" w:hAnsi="Nunito" w:cs="Nunito"/>
+                <w:b/>
+                <w:bCs/>
+                <w:color w:val="2F4F4F"/>
+                <w:sz w:val="18"/>
+              </w:rPr>
+              <w:t>+++</w:t>
             </w:r>
           </w:p>
           <w:p>
@@ -1716,7 +1828,6 @@
               <w:bottom w:val="nil"/>
               <w:right w:val="nil"/>
             </w:tcBorders>
-            <w:shd w:val="clear" w:color="auto" w:fill="auto"/>
             <w:vAlign w:val="center"/>
           </w:tcPr>
           <w:p>
@@ -1818,7 +1929,6 @@
               <w:bottom w:val="nil"/>
               <w:right w:val="nil"/>
             </w:tcBorders>
-            <w:shd w:val="clear" w:color="auto" w:fill="auto"/>
             <w:vAlign w:val="center"/>
           </w:tcPr>
           <w:p>
@@ -1836,7 +1946,6 @@
               <w:bottom w:val="nil"/>
               <w:right w:val="nil"/>
             </w:tcBorders>
-            <w:shd w:val="clear" w:color="auto" w:fill="auto"/>
             <w:vAlign w:val="center"/>
           </w:tcPr>
           <w:p>
@@ -1854,7 +1963,6 @@
               <w:bottom w:val="nil"/>
               <w:right w:val="nil"/>
             </w:tcBorders>
-            <w:shd w:val="clear" w:color="auto" w:fill="auto"/>
             <w:vAlign w:val="center"/>
           </w:tcPr>
           <w:p>
@@ -1877,7 +1985,6 @@
               <w:bottom w:val="nil"/>
               <w:right w:val="nil"/>
             </w:tcBorders>
-            <w:shd w:val="clear" w:color="auto" w:fill="auto"/>
             <w:vAlign w:val="center"/>
           </w:tcPr>
           <w:p>
@@ -1888,11 +1995,11 @@
                 <w:color w:val="2F4F4F"/>
               </w:rPr>
             </w:pPr>
-            <w:bookmarkStart w:id="17" w:name="OLE_LINK45"/>
-            <w:bookmarkStart w:id="18" w:name="OLE_LINK46"/>
-            <w:bookmarkStart w:id="19" w:name="OLE_LINK50"/>
-            <w:bookmarkStart w:id="20" w:name="OLE_LINK52"/>
-            <w:bookmarkStart w:id="21" w:name="OLE_LINK67"/>
+            <w:bookmarkStart w:id="18" w:name="OLE_LINK45"/>
+            <w:bookmarkStart w:id="19" w:name="OLE_LINK46"/>
+            <w:bookmarkStart w:id="20" w:name="OLE_LINK50"/>
+            <w:bookmarkStart w:id="21" w:name="OLE_LINK52"/>
+            <w:bookmarkStart w:id="22" w:name="OLE_LINK67"/>
             <w:r>
               <w:t>+++IMAGE tile(</w:t>
             </w:r>
@@ -1908,16 +2015,24 @@
             </w:r>
             <w:proofErr w:type="gramEnd"/>
             <w:r>
-              <w:t>0]</w:t>
-            </w:r>
-            <w:r>
-              <w:t>)+++</w:t>
-            </w:r>
-            <w:bookmarkEnd w:id="17"/>
+              <w:t>0</w:t>
+            </w:r>
+            <w:proofErr w:type="gramStart"/>
+            <w:r>
+              <w:t>]</w:t>
+            </w:r>
+            <w:r>
+              <w:t>)+</w:t>
+            </w:r>
+            <w:proofErr w:type="gramEnd"/>
+            <w:r>
+              <w:t>++</w:t>
+            </w:r>
             <w:bookmarkEnd w:id="18"/>
             <w:bookmarkEnd w:id="19"/>
             <w:bookmarkEnd w:id="20"/>
             <w:bookmarkEnd w:id="21"/>
+            <w:bookmarkEnd w:id="22"/>
           </w:p>
         </w:tc>
         <w:tc>
@@ -1929,7 +2044,6 @@
               <w:bottom w:val="nil"/>
               <w:right w:val="nil"/>
             </w:tcBorders>
-            <w:shd w:val="clear" w:color="auto" w:fill="auto"/>
             <w:vAlign w:val="center"/>
           </w:tcPr>
           <w:p>
@@ -1949,7 +2063,15 @@
             </w:r>
             <w:proofErr w:type="gramEnd"/>
             <w:r>
-              <w:t>1])+++</w:t>
+              <w:t>1</w:t>
+            </w:r>
+            <w:proofErr w:type="gramStart"/>
+            <w:r>
+              <w:t>])+</w:t>
+            </w:r>
+            <w:proofErr w:type="gramEnd"/>
+            <w:r>
+              <w:t>++</w:t>
             </w:r>
           </w:p>
         </w:tc>
@@ -1962,7 +2084,6 @@
               <w:bottom w:val="nil"/>
               <w:right w:val="nil"/>
             </w:tcBorders>
-            <w:shd w:val="clear" w:color="auto" w:fill="auto"/>
             <w:vAlign w:val="center"/>
           </w:tcPr>
           <w:p>
@@ -1982,7 +2103,15 @@
             </w:r>
             <w:proofErr w:type="gramEnd"/>
             <w:r>
-              <w:t>2])+++</w:t>
+              <w:t>2</w:t>
+            </w:r>
+            <w:proofErr w:type="gramStart"/>
+            <w:r>
+              <w:t>])+</w:t>
+            </w:r>
+            <w:proofErr w:type="gramEnd"/>
+            <w:r>
+              <w:t>++</w:t>
             </w:r>
           </w:p>
         </w:tc>
@@ -1995,7 +2124,6 @@
               <w:bottom w:val="nil"/>
               <w:right w:val="nil"/>
             </w:tcBorders>
-            <w:shd w:val="clear" w:color="auto" w:fill="auto"/>
             <w:vAlign w:val="center"/>
           </w:tcPr>
           <w:p>
@@ -2015,7 +2143,15 @@
             </w:r>
             <w:proofErr w:type="gramEnd"/>
             <w:r>
-              <w:t>3])+++</w:t>
+              <w:t>3</w:t>
+            </w:r>
+            <w:proofErr w:type="gramStart"/>
+            <w:r>
+              <w:t>])+</w:t>
+            </w:r>
+            <w:proofErr w:type="gramEnd"/>
+            <w:r>
+              <w:t>++</w:t>
             </w:r>
           </w:p>
         </w:tc>
@@ -2034,7 +2170,6 @@
               <w:bottom w:val="nil"/>
               <w:right w:val="nil"/>
             </w:tcBorders>
-            <w:shd w:val="clear" w:color="auto" w:fill="auto"/>
             <w:vAlign w:val="center"/>
           </w:tcPr>
           <w:p>
@@ -2071,10 +2206,10 @@
           <w:sz w:val="21"/>
         </w:rPr>
       </w:pPr>
-      <w:bookmarkStart w:id="22" w:name="OLE_LINK120"/>
-      <w:bookmarkStart w:id="23" w:name="OLE_LINK121"/>
-      <w:bookmarkStart w:id="24" w:name="OLE_LINK140"/>
-      <w:bookmarkStart w:id="25" w:name="OLE_LINK141"/>
+      <w:bookmarkStart w:id="23" w:name="OLE_LINK120"/>
+      <w:bookmarkStart w:id="24" w:name="OLE_LINK121"/>
+      <w:bookmarkStart w:id="25" w:name="OLE_LINK140"/>
+      <w:bookmarkStart w:id="26" w:name="OLE_LINK141"/>
       <w:r>
         <w:rPr>
           <w:rFonts w:ascii="Nunito" w:eastAsia="Nunito" w:hAnsi="Nunito" w:cs="Nunito"/>
@@ -2083,13 +2218,14 @@
           <w:color w:val="2F4F4F"/>
           <w:sz w:val="21"/>
         </w:rPr>
+        <w:lastRenderedPageBreak/>
         <w:t>+++END-IF+++</w:t>
       </w:r>
     </w:p>
-    <w:bookmarkEnd w:id="22"/>
     <w:bookmarkEnd w:id="23"/>
     <w:bookmarkEnd w:id="24"/>
     <w:bookmarkEnd w:id="25"/>
+    <w:bookmarkEnd w:id="26"/>
     <w:p>
       <w:pPr>
         <w:rPr>
@@ -2108,7 +2244,6 @@
           <w:color w:val="2F4F4F"/>
           <w:sz w:val="21"/>
         </w:rPr>
-        <w:lastRenderedPageBreak/>
         <w:t xml:space="preserve">+++IF </w:t>
       </w:r>
       <w:proofErr w:type="spellStart"/>
@@ -2123,8 +2258,8 @@
         </w:rPr>
         <w:t>section.</w:t>
       </w:r>
-      <w:bookmarkStart w:id="26" w:name="OLE_LINK126"/>
-      <w:bookmarkStart w:id="27" w:name="OLE_LINK127"/>
+      <w:bookmarkStart w:id="27" w:name="OLE_LINK126"/>
+      <w:bookmarkStart w:id="28" w:name="OLE_LINK127"/>
       <w:r>
         <w:rPr>
           <w:rFonts w:ascii="Nunito" w:eastAsia="Nunito" w:hAnsi="Nunito" w:cs="Nunito"/>
@@ -2135,8 +2270,8 @@
         </w:rPr>
         <w:t>isUnitUnavailable</w:t>
       </w:r>
-      <w:bookmarkEnd w:id="26"/>
       <w:bookmarkEnd w:id="27"/>
+      <w:bookmarkEnd w:id="28"/>
       <w:proofErr w:type="spellEnd"/>
       <w:proofErr w:type="gramEnd"/>
       <w:r>
@@ -2241,7 +2376,7 @@
                 <w:sz w:val="18"/>
               </w:rPr>
             </w:pPr>
-            <w:bookmarkStart w:id="28" w:name="_Hlk146457483"/>
+            <w:bookmarkStart w:id="29" w:name="_Hlk146457483"/>
             <w:r>
               <w:rPr>
                 <w:rFonts w:ascii="Nunito" w:eastAsia="Nunito" w:hAnsi="Nunito" w:cs="Nunito"/>
@@ -2499,7 +2634,7 @@
           </w:p>
         </w:tc>
       </w:tr>
-      <w:bookmarkEnd w:id="28"/>
+      <w:bookmarkEnd w:id="29"/>
     </w:tbl>
     <w:p>
       <w:pPr>
@@ -2765,8 +2900,8 @@
           <w:sz w:val="21"/>
         </w:rPr>
       </w:pPr>
-      <w:bookmarkStart w:id="29" w:name="OLE_LINK107"/>
-      <w:bookmarkStart w:id="30" w:name="OLE_LINK108"/>
+      <w:bookmarkStart w:id="30" w:name="OLE_LINK107"/>
+      <w:bookmarkStart w:id="31" w:name="OLE_LINK108"/>
       <w:r>
         <w:rPr>
           <w:rFonts w:ascii="Nunito" w:eastAsia="Nunito" w:hAnsi="Nunito" w:cs="Nunito"/>
@@ -2892,9 +3027,9 @@
                 <w:color w:val="2F4F4F"/>
               </w:rPr>
             </w:pPr>
-            <w:bookmarkStart w:id="31" w:name="OLE_LINK78"/>
-            <w:bookmarkStart w:id="32" w:name="OLE_LINK79"/>
-            <w:bookmarkStart w:id="33" w:name="OLE_LINK105"/>
+            <w:bookmarkStart w:id="32" w:name="OLE_LINK78"/>
+            <w:bookmarkStart w:id="33" w:name="OLE_LINK79"/>
+            <w:bookmarkStart w:id="34" w:name="OLE_LINK105"/>
             <w:r>
               <w:rPr>
                 <w:rFonts w:ascii="Nunito" w:eastAsia="Nunito" w:hAnsi="Nunito" w:cs="Nunito"/>
@@ -2932,8 +3067,8 @@
                 <w:sz w:val="18"/>
               </w:rPr>
             </w:pPr>
-            <w:bookmarkStart w:id="34" w:name="_Hlk144041558"/>
-            <w:bookmarkStart w:id="35" w:name="_Hlk144041537"/>
+            <w:bookmarkStart w:id="35" w:name="_Hlk144041558"/>
+            <w:bookmarkStart w:id="36" w:name="_Hlk144041537"/>
             <w:r>
               <w:rPr>
                 <w:rFonts w:ascii="Nunito" w:eastAsia="Nunito" w:hAnsi="Nunito" w:cs="Nunito"/>
@@ -2994,8 +3129,8 @@
               </w:rPr>
               <w:t>section.</w:t>
             </w:r>
-            <w:bookmarkStart w:id="36" w:name="OLE_LINK10"/>
-            <w:bookmarkStart w:id="37" w:name="OLE_LINK11"/>
+            <w:bookmarkStart w:id="37" w:name="OLE_LINK10"/>
+            <w:bookmarkStart w:id="38" w:name="OLE_LINK11"/>
             <w:r>
               <w:rPr>
                 <w:rFonts w:ascii="Nunito" w:eastAsia="Nunito" w:hAnsi="Nunito" w:cs="Nunito"/>
@@ -3006,8 +3141,8 @@
               </w:rPr>
               <w:t>invasiveDesc</w:t>
             </w:r>
-            <w:bookmarkEnd w:id="36"/>
             <w:bookmarkEnd w:id="37"/>
+            <w:bookmarkEnd w:id="38"/>
             <w:proofErr w:type="spellEnd"/>
             <w:proofErr w:type="gramEnd"/>
             <w:r>
@@ -3023,8 +3158,8 @@
           </w:p>
         </w:tc>
       </w:tr>
-      <w:bookmarkEnd w:id="34"/>
       <w:bookmarkEnd w:id="35"/>
+      <w:bookmarkEnd w:id="36"/>
     </w:tbl>
     <w:p>
       <w:pPr>
@@ -3115,7 +3250,6 @@
               <w:bottom w:val="nil"/>
               <w:right w:val="nil"/>
             </w:tcBorders>
-            <w:shd w:val="clear" w:color="auto" w:fill="auto"/>
             <w:vAlign w:val="center"/>
           </w:tcPr>
           <w:p>
@@ -3217,7 +3351,6 @@
               <w:bottom w:val="nil"/>
               <w:right w:val="nil"/>
             </w:tcBorders>
-            <w:shd w:val="clear" w:color="auto" w:fill="auto"/>
             <w:vAlign w:val="center"/>
           </w:tcPr>
           <w:p>
@@ -3235,7 +3368,6 @@
               <w:bottom w:val="nil"/>
               <w:right w:val="nil"/>
             </w:tcBorders>
-            <w:shd w:val="clear" w:color="auto" w:fill="auto"/>
             <w:vAlign w:val="center"/>
           </w:tcPr>
           <w:p>
@@ -3253,7 +3385,6 @@
               <w:bottom w:val="nil"/>
               <w:right w:val="nil"/>
             </w:tcBorders>
-            <w:shd w:val="clear" w:color="auto" w:fill="auto"/>
             <w:vAlign w:val="center"/>
           </w:tcPr>
           <w:p>
@@ -3276,7 +3407,6 @@
               <w:bottom w:val="nil"/>
               <w:right w:val="nil"/>
             </w:tcBorders>
-            <w:shd w:val="clear" w:color="auto" w:fill="auto"/>
             <w:vAlign w:val="center"/>
           </w:tcPr>
           <w:p>
@@ -3296,7 +3426,15 @@
             </w:r>
             <w:proofErr w:type="gramEnd"/>
             <w:r>
-              <w:t>0])+++</w:t>
+              <w:t>0</w:t>
+            </w:r>
+            <w:proofErr w:type="gramStart"/>
+            <w:r>
+              <w:t>])+</w:t>
+            </w:r>
+            <w:proofErr w:type="gramEnd"/>
+            <w:r>
+              <w:t>++</w:t>
             </w:r>
           </w:p>
         </w:tc>
@@ -3309,7 +3447,6 @@
               <w:bottom w:val="nil"/>
               <w:right w:val="nil"/>
             </w:tcBorders>
-            <w:shd w:val="clear" w:color="auto" w:fill="auto"/>
             <w:vAlign w:val="center"/>
           </w:tcPr>
           <w:p>
@@ -3329,7 +3466,15 @@
             </w:r>
             <w:proofErr w:type="gramEnd"/>
             <w:r>
-              <w:t>1])+++</w:t>
+              <w:t>1</w:t>
+            </w:r>
+            <w:proofErr w:type="gramStart"/>
+            <w:r>
+              <w:t>])+</w:t>
+            </w:r>
+            <w:proofErr w:type="gramEnd"/>
+            <w:r>
+              <w:t>++</w:t>
             </w:r>
           </w:p>
         </w:tc>
@@ -3342,7 +3487,6 @@
               <w:bottom w:val="nil"/>
               <w:right w:val="nil"/>
             </w:tcBorders>
-            <w:shd w:val="clear" w:color="auto" w:fill="auto"/>
             <w:vAlign w:val="center"/>
           </w:tcPr>
           <w:p>
@@ -3362,7 +3506,15 @@
             </w:r>
             <w:proofErr w:type="gramEnd"/>
             <w:r>
-              <w:t>2])+++</w:t>
+              <w:t>2</w:t>
+            </w:r>
+            <w:proofErr w:type="gramStart"/>
+            <w:r>
+              <w:t>])+</w:t>
+            </w:r>
+            <w:proofErr w:type="gramEnd"/>
+            <w:r>
+              <w:t>++</w:t>
             </w:r>
           </w:p>
         </w:tc>
@@ -3375,7 +3527,6 @@
               <w:bottom w:val="nil"/>
               <w:right w:val="nil"/>
             </w:tcBorders>
-            <w:shd w:val="clear" w:color="auto" w:fill="auto"/>
             <w:vAlign w:val="center"/>
           </w:tcPr>
           <w:p>
@@ -3395,7 +3546,15 @@
             </w:r>
             <w:proofErr w:type="gramEnd"/>
             <w:r>
-              <w:t>3])+++</w:t>
+              <w:t>3</w:t>
+            </w:r>
+            <w:proofErr w:type="gramStart"/>
+            <w:r>
+              <w:t>])+</w:t>
+            </w:r>
+            <w:proofErr w:type="gramEnd"/>
+            <w:r>
+              <w:t>++</w:t>
             </w:r>
           </w:p>
         </w:tc>
@@ -3414,7 +3573,6 @@
               <w:bottom w:val="nil"/>
               <w:right w:val="nil"/>
             </w:tcBorders>
-            <w:shd w:val="clear" w:color="auto" w:fill="auto"/>
             <w:vAlign w:val="center"/>
           </w:tcPr>
           <w:p>
@@ -3440,9 +3598,9 @@
         </w:tc>
       </w:tr>
     </w:tbl>
-    <w:bookmarkEnd w:id="31"/>
     <w:bookmarkEnd w:id="32"/>
     <w:bookmarkEnd w:id="33"/>
+    <w:bookmarkEnd w:id="34"/>
     <w:p>
       <w:r>
         <w:t xml:space="preserve">+++IF </w:t>
@@ -4152,7 +4310,6 @@
               <w:bottom w:val="nil"/>
               <w:right w:val="nil"/>
             </w:tcBorders>
-            <w:shd w:val="clear" w:color="auto" w:fill="auto"/>
             <w:vAlign w:val="center"/>
           </w:tcPr>
           <w:p>
@@ -4201,10 +4358,18 @@
             </w:r>
             <w:proofErr w:type="gramEnd"/>
             <w:r>
-              <w:t>,4)</w:t>
-            </w:r>
-            <w:r>
-              <w:t>+++</w:t>
+              <w:t>,</w:t>
+            </w:r>
+            <w:proofErr w:type="gramStart"/>
+            <w:r>
+              <w:t>4)</w:t>
+            </w:r>
+            <w:r>
+              <w:t>+</w:t>
+            </w:r>
+            <w:proofErr w:type="gramEnd"/>
+            <w:r>
+              <w:t>++</w:t>
             </w:r>
           </w:p>
           <w:p>
@@ -4222,7 +4387,6 @@
               <w:bottom w:val="nil"/>
               <w:right w:val="nil"/>
             </w:tcBorders>
-            <w:shd w:val="clear" w:color="auto" w:fill="auto"/>
             <w:vAlign w:val="center"/>
           </w:tcPr>
           <w:p>
@@ -4240,7 +4404,6 @@
               <w:bottom w:val="nil"/>
               <w:right w:val="nil"/>
             </w:tcBorders>
-            <w:shd w:val="clear" w:color="auto" w:fill="auto"/>
             <w:vAlign w:val="center"/>
           </w:tcPr>
           <w:p>
@@ -4258,7 +4421,6 @@
               <w:bottom w:val="nil"/>
               <w:right w:val="nil"/>
             </w:tcBorders>
-            <w:shd w:val="clear" w:color="auto" w:fill="auto"/>
             <w:vAlign w:val="center"/>
           </w:tcPr>
           <w:p>
@@ -4281,7 +4443,6 @@
               <w:bottom w:val="nil"/>
               <w:right w:val="nil"/>
             </w:tcBorders>
-            <w:shd w:val="clear" w:color="auto" w:fill="auto"/>
             <w:vAlign w:val="center"/>
           </w:tcPr>
           <w:p>
@@ -4293,6 +4454,7 @@
               </w:rPr>
             </w:pPr>
             <w:r>
+              <w:lastRenderedPageBreak/>
               <w:t>+++IMAGE tile($</w:t>
             </w:r>
             <w:proofErr w:type="gramStart"/>
@@ -4301,7 +4463,15 @@
             </w:r>
             <w:proofErr w:type="gramEnd"/>
             <w:r>
-              <w:t>0])+++</w:t>
+              <w:t>0</w:t>
+            </w:r>
+            <w:proofErr w:type="gramStart"/>
+            <w:r>
+              <w:t>])+</w:t>
+            </w:r>
+            <w:proofErr w:type="gramEnd"/>
+            <w:r>
+              <w:t>++</w:t>
             </w:r>
           </w:p>
         </w:tc>
@@ -4314,7 +4484,6 @@
               <w:bottom w:val="nil"/>
               <w:right w:val="nil"/>
             </w:tcBorders>
-            <w:shd w:val="clear" w:color="auto" w:fill="auto"/>
             <w:vAlign w:val="center"/>
           </w:tcPr>
           <w:p>
@@ -4334,7 +4503,15 @@
             </w:r>
             <w:proofErr w:type="gramEnd"/>
             <w:r>
-              <w:t>1])+++</w:t>
+              <w:t>1</w:t>
+            </w:r>
+            <w:proofErr w:type="gramStart"/>
+            <w:r>
+              <w:t>])+</w:t>
+            </w:r>
+            <w:proofErr w:type="gramEnd"/>
+            <w:r>
+              <w:t>++</w:t>
             </w:r>
           </w:p>
         </w:tc>
@@ -4347,7 +4524,6 @@
               <w:bottom w:val="nil"/>
               <w:right w:val="nil"/>
             </w:tcBorders>
-            <w:shd w:val="clear" w:color="auto" w:fill="auto"/>
             <w:vAlign w:val="center"/>
           </w:tcPr>
           <w:p>
@@ -4367,7 +4543,15 @@
             </w:r>
             <w:proofErr w:type="gramEnd"/>
             <w:r>
-              <w:t>2])+++</w:t>
+              <w:t>2</w:t>
+            </w:r>
+            <w:proofErr w:type="gramStart"/>
+            <w:r>
+              <w:t>])+</w:t>
+            </w:r>
+            <w:proofErr w:type="gramEnd"/>
+            <w:r>
+              <w:t>++</w:t>
             </w:r>
           </w:p>
         </w:tc>
@@ -4380,7 +4564,6 @@
               <w:bottom w:val="nil"/>
               <w:right w:val="nil"/>
             </w:tcBorders>
-            <w:shd w:val="clear" w:color="auto" w:fill="auto"/>
             <w:vAlign w:val="center"/>
           </w:tcPr>
           <w:p>
@@ -4400,7 +4583,15 @@
             </w:r>
             <w:proofErr w:type="gramEnd"/>
             <w:r>
-              <w:t>3])+++</w:t>
+              <w:t>3</w:t>
+            </w:r>
+            <w:proofErr w:type="gramStart"/>
+            <w:r>
+              <w:t>])+</w:t>
+            </w:r>
+            <w:proofErr w:type="gramEnd"/>
+            <w:r>
+              <w:t>++</w:t>
             </w:r>
           </w:p>
         </w:tc>
@@ -4419,12 +4610,10 @@
               <w:bottom w:val="nil"/>
               <w:right w:val="nil"/>
             </w:tcBorders>
-            <w:shd w:val="clear" w:color="auto" w:fill="auto"/>
-            <w:vAlign w:val="center"/>
-          </w:tcPr>
-          <w:p>
-            <w:r>
-              <w:lastRenderedPageBreak/>
+            <w:vAlign w:val="center"/>
+          </w:tcPr>
+          <w:p>
+            <w:r>
               <w:t xml:space="preserve">+++END-FOR </w:t>
             </w:r>
             <w:r>
@@ -4619,13 +4808,13 @@
       <w:r>
         <w:t>section.</w:t>
       </w:r>
-      <w:bookmarkStart w:id="38" w:name="OLE_LINK134"/>
-      <w:bookmarkStart w:id="39" w:name="OLE_LINK135"/>
+      <w:bookmarkStart w:id="39" w:name="OLE_LINK134"/>
+      <w:bookmarkStart w:id="40" w:name="OLE_LINK135"/>
       <w:r>
         <w:t>propowneragreed</w:t>
       </w:r>
-      <w:bookmarkEnd w:id="38"/>
       <w:bookmarkEnd w:id="39"/>
+      <w:bookmarkEnd w:id="40"/>
       <w:proofErr w:type="spellEnd"/>
       <w:proofErr w:type="gramEnd"/>
       <w:r>
@@ -4776,10 +4965,10 @@
       </w:r>
     </w:p>
     <w:p>
-      <w:bookmarkStart w:id="40" w:name="OLE_LINK118"/>
-      <w:bookmarkStart w:id="41" w:name="OLE_LINK119"/>
-      <w:bookmarkEnd w:id="29"/>
+      <w:bookmarkStart w:id="41" w:name="OLE_LINK118"/>
+      <w:bookmarkStart w:id="42" w:name="OLE_LINK119"/>
       <w:bookmarkEnd w:id="30"/>
+      <w:bookmarkEnd w:id="31"/>
       <w:r>
         <w:t xml:space="preserve">+++IF </w:t>
       </w:r>
@@ -5143,8 +5332,8 @@
           </w:p>
         </w:tc>
       </w:tr>
-      <w:bookmarkEnd w:id="40"/>
       <w:bookmarkEnd w:id="41"/>
+      <w:bookmarkEnd w:id="42"/>
       <w:tr>
         <w:trPr>
           <w:jc w:val="center"/>
@@ -5373,7 +5562,6 @@
               <w:bottom w:val="nil"/>
               <w:right w:val="nil"/>
             </w:tcBorders>
-            <w:shd w:val="clear" w:color="auto" w:fill="auto"/>
             <w:vAlign w:val="center"/>
           </w:tcPr>
           <w:p>
@@ -5475,7 +5663,6 @@
               <w:bottom w:val="nil"/>
               <w:right w:val="nil"/>
             </w:tcBorders>
-            <w:shd w:val="clear" w:color="auto" w:fill="auto"/>
             <w:vAlign w:val="center"/>
           </w:tcPr>
           <w:p>
@@ -5493,7 +5680,6 @@
               <w:bottom w:val="nil"/>
               <w:right w:val="nil"/>
             </w:tcBorders>
-            <w:shd w:val="clear" w:color="auto" w:fill="auto"/>
             <w:vAlign w:val="center"/>
           </w:tcPr>
           <w:p>
@@ -5511,7 +5697,6 @@
               <w:bottom w:val="nil"/>
               <w:right w:val="nil"/>
             </w:tcBorders>
-            <w:shd w:val="clear" w:color="auto" w:fill="auto"/>
             <w:vAlign w:val="center"/>
           </w:tcPr>
           <w:p>
@@ -5534,7 +5719,6 @@
               <w:bottom w:val="nil"/>
               <w:right w:val="nil"/>
             </w:tcBorders>
-            <w:shd w:val="clear" w:color="auto" w:fill="auto"/>
             <w:vAlign w:val="center"/>
           </w:tcPr>
           <w:p>
@@ -5554,7 +5738,15 @@
             </w:r>
             <w:proofErr w:type="gramEnd"/>
             <w:r>
-              <w:t>0])+++</w:t>
+              <w:t>0</w:t>
+            </w:r>
+            <w:proofErr w:type="gramStart"/>
+            <w:r>
+              <w:t>])+</w:t>
+            </w:r>
+            <w:proofErr w:type="gramEnd"/>
+            <w:r>
+              <w:t>++</w:t>
             </w:r>
           </w:p>
         </w:tc>
@@ -5567,7 +5759,6 @@
               <w:bottom w:val="nil"/>
               <w:right w:val="nil"/>
             </w:tcBorders>
-            <w:shd w:val="clear" w:color="auto" w:fill="auto"/>
             <w:vAlign w:val="center"/>
           </w:tcPr>
           <w:p>
@@ -5587,7 +5778,15 @@
             </w:r>
             <w:proofErr w:type="gramEnd"/>
             <w:r>
-              <w:t>1])+++</w:t>
+              <w:t>1</w:t>
+            </w:r>
+            <w:proofErr w:type="gramStart"/>
+            <w:r>
+              <w:t>])+</w:t>
+            </w:r>
+            <w:proofErr w:type="gramEnd"/>
+            <w:r>
+              <w:t>++</w:t>
             </w:r>
           </w:p>
         </w:tc>
@@ -5600,7 +5799,6 @@
               <w:bottom w:val="nil"/>
               <w:right w:val="nil"/>
             </w:tcBorders>
-            <w:shd w:val="clear" w:color="auto" w:fill="auto"/>
             <w:vAlign w:val="center"/>
           </w:tcPr>
           <w:p>
@@ -5620,7 +5818,15 @@
             </w:r>
             <w:proofErr w:type="gramEnd"/>
             <w:r>
-              <w:t>2])+++</w:t>
+              <w:t>2</w:t>
+            </w:r>
+            <w:proofErr w:type="gramStart"/>
+            <w:r>
+              <w:t>])+</w:t>
+            </w:r>
+            <w:proofErr w:type="gramEnd"/>
+            <w:r>
+              <w:t>++</w:t>
             </w:r>
           </w:p>
         </w:tc>
@@ -5633,7 +5839,6 @@
               <w:bottom w:val="nil"/>
               <w:right w:val="nil"/>
             </w:tcBorders>
-            <w:shd w:val="clear" w:color="auto" w:fill="auto"/>
             <w:vAlign w:val="center"/>
           </w:tcPr>
           <w:p>
@@ -5653,7 +5858,15 @@
             </w:r>
             <w:proofErr w:type="gramEnd"/>
             <w:r>
-              <w:t>3])+++</w:t>
+              <w:t>3</w:t>
+            </w:r>
+            <w:proofErr w:type="gramStart"/>
+            <w:r>
+              <w:t>])+</w:t>
+            </w:r>
+            <w:proofErr w:type="gramEnd"/>
+            <w:r>
+              <w:t>++</w:t>
             </w:r>
           </w:p>
         </w:tc>
@@ -5672,7 +5885,6 @@
               <w:bottom w:val="nil"/>
               <w:right w:val="nil"/>
             </w:tcBorders>
-            <w:shd w:val="clear" w:color="auto" w:fill="auto"/>
             <w:vAlign w:val="center"/>
           </w:tcPr>
           <w:p>
@@ -5699,8 +5911,8 @@
       </w:tr>
     </w:tbl>
     <w:p>
-      <w:bookmarkStart w:id="42" w:name="OLE_LINK109"/>
-      <w:bookmarkStart w:id="43" w:name="OLE_LINK110"/>
+      <w:bookmarkStart w:id="43" w:name="OLE_LINK109"/>
+      <w:bookmarkStart w:id="44" w:name="OLE_LINK110"/>
       <w:r>
         <w:t xml:space="preserve">+++IF </w:t>
       </w:r>
@@ -5709,17 +5921,17 @@
       <w:r>
         <w:t>section.</w:t>
       </w:r>
-      <w:bookmarkStart w:id="44" w:name="OLE_LINK130"/>
-      <w:bookmarkStart w:id="45" w:name="OLE_LINK131"/>
-      <w:bookmarkStart w:id="46" w:name="OLE_LINK12"/>
-      <w:bookmarkStart w:id="47" w:name="OLE_LINK22"/>
+      <w:bookmarkStart w:id="45" w:name="OLE_LINK130"/>
+      <w:bookmarkStart w:id="46" w:name="OLE_LINK131"/>
+      <w:bookmarkStart w:id="47" w:name="OLE_LINK12"/>
+      <w:bookmarkStart w:id="48" w:name="OLE_LINK22"/>
       <w:r>
         <w:t>furtherInvasiveRequired</w:t>
       </w:r>
-      <w:bookmarkEnd w:id="44"/>
       <w:bookmarkEnd w:id="45"/>
       <w:bookmarkEnd w:id="46"/>
       <w:bookmarkEnd w:id="47"/>
+      <w:bookmarkEnd w:id="48"/>
       <w:proofErr w:type="spellEnd"/>
       <w:proofErr w:type="gramEnd"/>
       <w:r>
@@ -5764,15 +5976,15 @@
       <w:r>
         <w:t>section.</w:t>
       </w:r>
-      <w:bookmarkStart w:id="48" w:name="OLE_LINK13"/>
-      <w:bookmarkStart w:id="49" w:name="OLE_LINK14"/>
-      <w:bookmarkStart w:id="50" w:name="OLE_LINK23"/>
+      <w:bookmarkStart w:id="49" w:name="OLE_LINK13"/>
+      <w:bookmarkStart w:id="50" w:name="OLE_LINK14"/>
+      <w:bookmarkStart w:id="51" w:name="OLE_LINK23"/>
       <w:r>
         <w:t>propowneragreed</w:t>
       </w:r>
-      <w:bookmarkEnd w:id="48"/>
       <w:bookmarkEnd w:id="49"/>
       <w:bookmarkEnd w:id="50"/>
+      <w:bookmarkEnd w:id="51"/>
       <w:proofErr w:type="spellEnd"/>
       <w:proofErr w:type="gramEnd"/>
       <w:r>
@@ -5809,8 +6021,8 @@
       <w:pPr>
         <w:ind w:left="720" w:firstLine="720"/>
       </w:pPr>
-      <w:bookmarkStart w:id="51" w:name="OLE_LINK114"/>
-      <w:bookmarkStart w:id="52" w:name="OLE_LINK115"/>
+      <w:bookmarkStart w:id="52" w:name="OLE_LINK114"/>
+      <w:bookmarkStart w:id="53" w:name="OLE_LINK115"/>
       <w:r>
         <w:t xml:space="preserve">+++IF </w:t>
       </w:r>
@@ -5819,15 +6031,15 @@
       <w:r>
         <w:t>section.</w:t>
       </w:r>
-      <w:bookmarkStart w:id="53" w:name="OLE_LINK132"/>
-      <w:bookmarkStart w:id="54" w:name="OLE_LINK133"/>
-      <w:bookmarkStart w:id="55" w:name="OLE_LINK15"/>
+      <w:bookmarkStart w:id="54" w:name="OLE_LINK132"/>
+      <w:bookmarkStart w:id="55" w:name="OLE_LINK133"/>
+      <w:bookmarkStart w:id="56" w:name="OLE_LINK15"/>
       <w:r>
         <w:t>invasiverepairsinspectedandcompleted</w:t>
       </w:r>
-      <w:bookmarkEnd w:id="53"/>
       <w:bookmarkEnd w:id="54"/>
       <w:bookmarkEnd w:id="55"/>
+      <w:bookmarkEnd w:id="56"/>
       <w:proofErr w:type="spellEnd"/>
       <w:proofErr w:type="gramEnd"/>
       <w:r>
@@ -5860,8 +6072,8 @@
         <w:t>+++</w:t>
       </w:r>
     </w:p>
-    <w:bookmarkEnd w:id="51"/>
     <w:bookmarkEnd w:id="52"/>
+    <w:bookmarkEnd w:id="53"/>
     <w:p>
       <w:pPr>
         <w:rPr>
@@ -5919,8 +6131,8 @@
                 <w:color w:val="2F4F4F"/>
               </w:rPr>
             </w:pPr>
-            <w:bookmarkStart w:id="56" w:name="OLE_LINK112"/>
-            <w:bookmarkStart w:id="57" w:name="OLE_LINK113"/>
+            <w:bookmarkStart w:id="57" w:name="OLE_LINK112"/>
+            <w:bookmarkStart w:id="58" w:name="OLE_LINK113"/>
             <w:r>
               <w:rPr>
                 <w:rFonts w:ascii="Nunito" w:eastAsia="Nunito" w:hAnsi="Nunito" w:cs="Nunito"/>
@@ -6051,8 +6263,8 @@
           </w:p>
         </w:tc>
       </w:tr>
-      <w:bookmarkEnd w:id="56"/>
       <w:bookmarkEnd w:id="57"/>
+      <w:bookmarkEnd w:id="58"/>
       <w:tr>
         <w:trPr>
           <w:jc w:val="center"/>
@@ -6086,6 +6298,7 @@
                 <w:color w:val="2F4F4F"/>
                 <w:sz w:val="18"/>
               </w:rPr>
+              <w:lastRenderedPageBreak/>
               <w:t>Life Expectancy (EEE)</w:t>
             </w:r>
           </w:p>
@@ -6187,7 +6400,6 @@
                 <w:color w:val="2F4F4F"/>
                 <w:sz w:val="18"/>
               </w:rPr>
-              <w:lastRenderedPageBreak/>
               <w:t>Life Expectancy (LBC)</w:t>
             </w:r>
           </w:p>
@@ -6441,7 +6653,6 @@
               <w:bottom w:val="nil"/>
               <w:right w:val="nil"/>
             </w:tcBorders>
-            <w:shd w:val="clear" w:color="auto" w:fill="auto"/>
             <w:vAlign w:val="center"/>
           </w:tcPr>
           <w:p>
@@ -6531,7 +6742,6 @@
               <w:bottom w:val="nil"/>
               <w:right w:val="nil"/>
             </w:tcBorders>
-            <w:shd w:val="clear" w:color="auto" w:fill="auto"/>
             <w:vAlign w:val="center"/>
           </w:tcPr>
           <w:p>
@@ -6549,7 +6759,6 @@
               <w:bottom w:val="nil"/>
               <w:right w:val="nil"/>
             </w:tcBorders>
-            <w:shd w:val="clear" w:color="auto" w:fill="auto"/>
             <w:vAlign w:val="center"/>
           </w:tcPr>
           <w:p>
@@ -6567,7 +6776,6 @@
               <w:bottom w:val="nil"/>
               <w:right w:val="nil"/>
             </w:tcBorders>
-            <w:shd w:val="clear" w:color="auto" w:fill="auto"/>
             <w:vAlign w:val="center"/>
           </w:tcPr>
           <w:p>
@@ -6590,7 +6798,6 @@
               <w:bottom w:val="nil"/>
               <w:right w:val="nil"/>
             </w:tcBorders>
-            <w:shd w:val="clear" w:color="auto" w:fill="auto"/>
             <w:vAlign w:val="center"/>
           </w:tcPr>
           <w:p>
@@ -6610,7 +6817,15 @@
             </w:r>
             <w:proofErr w:type="gramEnd"/>
             <w:r>
-              <w:t>0])+++</w:t>
+              <w:t>0</w:t>
+            </w:r>
+            <w:proofErr w:type="gramStart"/>
+            <w:r>
+              <w:t>])+</w:t>
+            </w:r>
+            <w:proofErr w:type="gramEnd"/>
+            <w:r>
+              <w:t>++</w:t>
             </w:r>
           </w:p>
         </w:tc>
@@ -6623,7 +6838,6 @@
               <w:bottom w:val="nil"/>
               <w:right w:val="nil"/>
             </w:tcBorders>
-            <w:shd w:val="clear" w:color="auto" w:fill="auto"/>
             <w:vAlign w:val="center"/>
           </w:tcPr>
           <w:p>
@@ -6643,7 +6857,15 @@
             </w:r>
             <w:proofErr w:type="gramEnd"/>
             <w:r>
-              <w:t>1])+++</w:t>
+              <w:t>1</w:t>
+            </w:r>
+            <w:proofErr w:type="gramStart"/>
+            <w:r>
+              <w:t>])+</w:t>
+            </w:r>
+            <w:proofErr w:type="gramEnd"/>
+            <w:r>
+              <w:t>++</w:t>
             </w:r>
           </w:p>
         </w:tc>
@@ -6656,7 +6878,6 @@
               <w:bottom w:val="nil"/>
               <w:right w:val="nil"/>
             </w:tcBorders>
-            <w:shd w:val="clear" w:color="auto" w:fill="auto"/>
             <w:vAlign w:val="center"/>
           </w:tcPr>
           <w:p>
@@ -6676,7 +6897,15 @@
             </w:r>
             <w:proofErr w:type="gramEnd"/>
             <w:r>
-              <w:t>2])+++</w:t>
+              <w:t>2</w:t>
+            </w:r>
+            <w:proofErr w:type="gramStart"/>
+            <w:r>
+              <w:t>])+</w:t>
+            </w:r>
+            <w:proofErr w:type="gramEnd"/>
+            <w:r>
+              <w:t>++</w:t>
             </w:r>
           </w:p>
         </w:tc>
@@ -6689,7 +6918,6 @@
               <w:bottom w:val="nil"/>
               <w:right w:val="nil"/>
             </w:tcBorders>
-            <w:shd w:val="clear" w:color="auto" w:fill="auto"/>
             <w:vAlign w:val="center"/>
           </w:tcPr>
           <w:p>
@@ -6709,7 +6937,15 @@
             </w:r>
             <w:proofErr w:type="gramEnd"/>
             <w:r>
-              <w:t>3])+++</w:t>
+              <w:t>3</w:t>
+            </w:r>
+            <w:proofErr w:type="gramStart"/>
+            <w:r>
+              <w:t>])+</w:t>
+            </w:r>
+            <w:proofErr w:type="gramEnd"/>
+            <w:r>
+              <w:t>++</w:t>
             </w:r>
           </w:p>
         </w:tc>
@@ -6728,7 +6964,6 @@
               <w:bottom w:val="nil"/>
               <w:right w:val="nil"/>
             </w:tcBorders>
-            <w:shd w:val="clear" w:color="auto" w:fill="auto"/>
             <w:vAlign w:val="center"/>
           </w:tcPr>
           <w:p>
@@ -6767,8 +7002,8 @@
       <w:pPr>
         <w:ind w:left="720" w:firstLine="720"/>
       </w:pPr>
-      <w:bookmarkStart w:id="58" w:name="OLE_LINK116"/>
-      <w:bookmarkStart w:id="59" w:name="OLE_LINK117"/>
+      <w:bookmarkStart w:id="59" w:name="OLE_LINK116"/>
+      <w:bookmarkStart w:id="60" w:name="OLE_LINK117"/>
       <w:r>
         <w:t xml:space="preserve">+++IF </w:t>
       </w:r>
@@ -6777,13 +7012,13 @@
       <w:r>
         <w:t>section.</w:t>
       </w:r>
-      <w:bookmarkStart w:id="60" w:name="OLE_LINK16"/>
-      <w:bookmarkStart w:id="61" w:name="OLE_LINK17"/>
+      <w:bookmarkStart w:id="61" w:name="OLE_LINK16"/>
+      <w:bookmarkStart w:id="62" w:name="OLE_LINK17"/>
       <w:r>
         <w:t>invasiverepairsinspectedandcompleted</w:t>
       </w:r>
-      <w:bookmarkEnd w:id="60"/>
       <w:bookmarkEnd w:id="61"/>
+      <w:bookmarkEnd w:id="62"/>
       <w:proofErr w:type="spellEnd"/>
       <w:proofErr w:type="gramEnd"/>
       <w:r>
@@ -6856,8 +7091,8 @@
             </w:tcMar>
             <w:vAlign w:val="center"/>
           </w:tcPr>
-          <w:bookmarkEnd w:id="42"/>
           <w:bookmarkEnd w:id="43"/>
+          <w:bookmarkEnd w:id="44"/>
           <w:p>
             <w:pPr>
               <w:jc w:val="center"/>
@@ -6955,10 +7190,10 @@
       <w:pPr>
         <w:ind w:firstLine="720"/>
       </w:pPr>
-      <w:bookmarkStart w:id="62" w:name="OLE_LINK136"/>
-      <w:bookmarkStart w:id="63" w:name="OLE_LINK137"/>
-      <w:bookmarkEnd w:id="58"/>
+      <w:bookmarkStart w:id="63" w:name="OLE_LINK136"/>
+      <w:bookmarkStart w:id="64" w:name="OLE_LINK137"/>
       <w:bookmarkEnd w:id="59"/>
+      <w:bookmarkEnd w:id="60"/>
       <w:r>
         <w:t xml:space="preserve">+++IF </w:t>
       </w:r>
@@ -7004,8 +7239,8 @@
       <w:r>
         <w:t>+++</w:t>
       </w:r>
-      <w:bookmarkEnd w:id="62"/>
       <w:bookmarkEnd w:id="63"/>
+      <w:bookmarkEnd w:id="64"/>
     </w:p>
     <w:tbl>
       <w:tblPr>
@@ -7145,7 +7380,7 @@
 </file>
 
 <file path=word/endnotes.xml><?xml version="1.0" encoding="utf-8"?>
-<w:endnotes xmlns:wpc="http://schemas.microsoft.com/office/word/2010/wordprocessingCanvas" xmlns:cx="http://schemas.microsoft.com/office/drawing/2014/chartex" xmlns:cx1="http://schemas.microsoft.com/office/drawing/2015/9/8/chartex" xmlns:cx2="http://schemas.microsoft.com/office/drawing/2015/10/21/chartex" xmlns:cx3="http://schemas.microsoft.com/office/drawing/2016/5/9/chartex" xmlns:cx4="http://schemas.microsoft.com/office/drawing/2016/5/10/chartex" xmlns:cx5="http://schemas.microsoft.com/office/drawing/2016/5/11/chartex" xmlns:cx6="http://schemas.microsoft.com/office/drawing/2016/5/12/chartex" xmlns:cx7="http://schemas.microsoft.com/office/drawing/2016/5/13/chartex" xmlns:cx8="http://schemas.microsoft.com/office/drawing/2016/5/14/chartex" xmlns:mc="http://schemas.openxmlformats.org/markup-compatibility/2006" xmlns:aink="http://schemas.microsoft.com/office/drawing/2016/ink" xmlns:am3d="http://schemas.microsoft.com/office/drawing/2017/model3d" xmlns:o="urn:schemas-microsoft-com:office:office" xmlns:oel="http://schemas.microsoft.com/office/2019/extlst" xmlns:r="http://schemas.openxmlformats.org/officeDocument/2006/relationships" xmlns:m="http://schemas.openxmlformats.org/officeDocument/2006/math" xmlns:v="urn:schemas-microsoft-com:vml" xmlns:wp14="http://schemas.microsoft.com/office/word/2010/wordprocessingDrawing" xmlns:wp="http://schemas.openxmlformats.org/drawingml/2006/wordprocessingDrawing" xmlns:w10="urn:schemas-microsoft-com:office:word" xmlns:w="http://schemas.openxmlformats.org/wordprocessingml/2006/main" xmlns:w14="http://schemas.microsoft.com/office/word/2010/wordml" xmlns:w15="http://schemas.microsoft.com/office/word/2012/wordml" xmlns:w16cex="http://schemas.microsoft.com/office/word/2018/wordml/cex" xmlns:w16cid="http://schemas.microsoft.com/office/word/2016/wordml/cid" xmlns:w16="http://schemas.microsoft.com/office/word/2018/wordml" xmlns:w16sdtdh="http://schemas.microsoft.com/office/word/2020/wordml/sdtdatahash" xmlns:w16se="http://schemas.microsoft.com/office/word/2015/wordml/symex" xmlns:wpg="http://schemas.microsoft.com/office/word/2010/wordprocessingGroup" xmlns:wpi="http://schemas.microsoft.com/office/word/2010/wordprocessingInk" xmlns:wne="http://schemas.microsoft.com/office/word/2006/wordml" xmlns:wps="http://schemas.microsoft.com/office/word/2010/wordprocessingShape" mc:Ignorable="w14 w15 w16se w16cid w16 w16cex w16sdtdh wp14">
+<w:endnotes xmlns:wpc="http://schemas.microsoft.com/office/word/2010/wordprocessingCanvas" xmlns:cx="http://schemas.microsoft.com/office/drawing/2014/chartex" xmlns:cx1="http://schemas.microsoft.com/office/drawing/2015/9/8/chartex" xmlns:cx2="http://schemas.microsoft.com/office/drawing/2015/10/21/chartex" xmlns:cx3="http://schemas.microsoft.com/office/drawing/2016/5/9/chartex" xmlns:cx4="http://schemas.microsoft.com/office/drawing/2016/5/10/chartex" xmlns:cx5="http://schemas.microsoft.com/office/drawing/2016/5/11/chartex" xmlns:cx6="http://schemas.microsoft.com/office/drawing/2016/5/12/chartex" xmlns:cx7="http://schemas.microsoft.com/office/drawing/2016/5/13/chartex" xmlns:cx8="http://schemas.microsoft.com/office/drawing/2016/5/14/chartex" xmlns:mc="http://schemas.openxmlformats.org/markup-compatibility/2006" xmlns:aink="http://schemas.microsoft.com/office/drawing/2016/ink" xmlns:am3d="http://schemas.microsoft.com/office/drawing/2017/model3d" xmlns:o="urn:schemas-microsoft-com:office:office" xmlns:oel="http://schemas.microsoft.com/office/2019/extlst" xmlns:r="http://schemas.openxmlformats.org/officeDocument/2006/relationships" xmlns:m="http://schemas.openxmlformats.org/officeDocument/2006/math" xmlns:v="urn:schemas-microsoft-com:vml" xmlns:wp14="http://schemas.microsoft.com/office/word/2010/wordprocessingDrawing" xmlns:wp="http://schemas.openxmlformats.org/drawingml/2006/wordprocessingDrawing" xmlns:w10="urn:schemas-microsoft-com:office:word" xmlns:w="http://schemas.openxmlformats.org/wordprocessingml/2006/main" xmlns:w14="http://schemas.microsoft.com/office/word/2010/wordml" xmlns:w15="http://schemas.microsoft.com/office/word/2012/wordml" xmlns:w16cex="http://schemas.microsoft.com/office/word/2018/wordml/cex" xmlns:w16cid="http://schemas.microsoft.com/office/word/2016/wordml/cid" xmlns:w16="http://schemas.microsoft.com/office/word/2018/wordml" xmlns:w16du="http://schemas.microsoft.com/office/word/2023/wordml/word16du" xmlns:w16sdtdh="http://schemas.microsoft.com/office/word/2020/wordml/sdtdatahash" xmlns:w16sdtfl="http://schemas.microsoft.com/office/word/2024/wordml/sdtformatlock" xmlns:w16se="http://schemas.microsoft.com/office/word/2015/wordml/symex" xmlns:wpg="http://schemas.microsoft.com/office/word/2010/wordprocessingGroup" xmlns:wpi="http://schemas.microsoft.com/office/word/2010/wordprocessingInk" xmlns:wne="http://schemas.microsoft.com/office/word/2006/wordml" xmlns:wps="http://schemas.microsoft.com/office/word/2010/wordprocessingShape" mc:Ignorable="w14 w15 w16se w16cid w16 w16cex w16sdtdh w16sdtfl w16du wp14">
   <w:endnote w:type="separator" w:id="-1">
     <w:p>
       <w:r>
@@ -7164,7 +7399,7 @@
 </file>
 
 <file path=word/footer1.xml><?xml version="1.0" encoding="utf-8"?>
-<w:ftr xmlns:wpc="http://schemas.microsoft.com/office/word/2010/wordprocessingCanvas" xmlns:cx="http://schemas.microsoft.com/office/drawing/2014/chartex" xmlns:cx1="http://schemas.microsoft.com/office/drawing/2015/9/8/chartex" xmlns:cx2="http://schemas.microsoft.com/office/drawing/2015/10/21/chartex" xmlns:cx3="http://schemas.microsoft.com/office/drawing/2016/5/9/chartex" xmlns:cx4="http://schemas.microsoft.com/office/drawing/2016/5/10/chartex" xmlns:cx5="http://schemas.microsoft.com/office/drawing/2016/5/11/chartex" xmlns:cx6="http://schemas.microsoft.com/office/drawing/2016/5/12/chartex" xmlns:cx7="http://schemas.microsoft.com/office/drawing/2016/5/13/chartex" xmlns:cx8="http://schemas.microsoft.com/office/drawing/2016/5/14/chartex" xmlns:mc="http://schemas.openxmlformats.org/markup-compatibility/2006" xmlns:aink="http://schemas.microsoft.com/office/drawing/2016/ink" xmlns:am3d="http://schemas.microsoft.com/office/drawing/2017/model3d" xmlns:o="urn:schemas-microsoft-com:office:office" xmlns:oel="http://schemas.microsoft.com/office/2019/extlst" xmlns:r="http://schemas.openxmlformats.org/officeDocument/2006/relationships" xmlns:m="http://schemas.openxmlformats.org/officeDocument/2006/math" xmlns:v="urn:schemas-microsoft-com:vml" xmlns:wp14="http://schemas.microsoft.com/office/word/2010/wordprocessingDrawing" xmlns:wp="http://schemas.openxmlformats.org/drawingml/2006/wordprocessingDrawing" xmlns:w10="urn:schemas-microsoft-com:office:word" xmlns:w="http://schemas.openxmlformats.org/wordprocessingml/2006/main" xmlns:w14="http://schemas.microsoft.com/office/word/2010/wordml" xmlns:w15="http://schemas.microsoft.com/office/word/2012/wordml" xmlns:w16cex="http://schemas.microsoft.com/office/word/2018/wordml/cex" xmlns:w16cid="http://schemas.microsoft.com/office/word/2016/wordml/cid" xmlns:w16="http://schemas.microsoft.com/office/word/2018/wordml" xmlns:w16sdtdh="http://schemas.microsoft.com/office/word/2020/wordml/sdtdatahash" xmlns:w16se="http://schemas.microsoft.com/office/word/2015/wordml/symex" xmlns:wpg="http://schemas.microsoft.com/office/word/2010/wordprocessingGroup" xmlns:wpi="http://schemas.microsoft.com/office/word/2010/wordprocessingInk" xmlns:wne="http://schemas.microsoft.com/office/word/2006/wordml" xmlns:wps="http://schemas.microsoft.com/office/word/2010/wordprocessingShape" mc:Ignorable="w14 w15 w16se w16cid w16 w16cex w16sdtdh wp14">
+<w:ftr xmlns:wpc="http://schemas.microsoft.com/office/word/2010/wordprocessingCanvas" xmlns:cx="http://schemas.microsoft.com/office/drawing/2014/chartex" xmlns:cx1="http://schemas.microsoft.com/office/drawing/2015/9/8/chartex" xmlns:cx2="http://schemas.microsoft.com/office/drawing/2015/10/21/chartex" xmlns:cx3="http://schemas.microsoft.com/office/drawing/2016/5/9/chartex" xmlns:cx4="http://schemas.microsoft.com/office/drawing/2016/5/10/chartex" xmlns:cx5="http://schemas.microsoft.com/office/drawing/2016/5/11/chartex" xmlns:cx6="http://schemas.microsoft.com/office/drawing/2016/5/12/chartex" xmlns:cx7="http://schemas.microsoft.com/office/drawing/2016/5/13/chartex" xmlns:cx8="http://schemas.microsoft.com/office/drawing/2016/5/14/chartex" xmlns:mc="http://schemas.openxmlformats.org/markup-compatibility/2006" xmlns:aink="http://schemas.microsoft.com/office/drawing/2016/ink" xmlns:am3d="http://schemas.microsoft.com/office/drawing/2017/model3d" xmlns:o="urn:schemas-microsoft-com:office:office" xmlns:oel="http://schemas.microsoft.com/office/2019/extlst" xmlns:r="http://schemas.openxmlformats.org/officeDocument/2006/relationships" xmlns:m="http://schemas.openxmlformats.org/officeDocument/2006/math" xmlns:v="urn:schemas-microsoft-com:vml" xmlns:wp14="http://schemas.microsoft.com/office/word/2010/wordprocessingDrawing" xmlns:wp="http://schemas.openxmlformats.org/drawingml/2006/wordprocessingDrawing" xmlns:w10="urn:schemas-microsoft-com:office:word" xmlns:w="http://schemas.openxmlformats.org/wordprocessingml/2006/main" xmlns:w14="http://schemas.microsoft.com/office/word/2010/wordml" xmlns:w15="http://schemas.microsoft.com/office/word/2012/wordml" xmlns:w16cex="http://schemas.microsoft.com/office/word/2018/wordml/cex" xmlns:w16cid="http://schemas.microsoft.com/office/word/2016/wordml/cid" xmlns:w16="http://schemas.microsoft.com/office/word/2018/wordml" xmlns:w16du="http://schemas.microsoft.com/office/word/2023/wordml/word16du" xmlns:w16sdtdh="http://schemas.microsoft.com/office/word/2020/wordml/sdtdatahash" xmlns:w16sdtfl="http://schemas.microsoft.com/office/word/2024/wordml/sdtformatlock" xmlns:w16se="http://schemas.microsoft.com/office/word/2015/wordml/symex" xmlns:wpg="http://schemas.microsoft.com/office/word/2010/wordprocessingGroup" xmlns:wpi="http://schemas.microsoft.com/office/word/2010/wordprocessingInk" xmlns:wne="http://schemas.microsoft.com/office/word/2006/wordml" xmlns:wps="http://schemas.microsoft.com/office/word/2010/wordprocessingShape" mc:Ignorable="w14 w15 w16se w16cid w16 w16cex w16sdtdh w16sdtfl w16du wp14">
   <w:p>
     <w:pPr>
       <w:pStyle w:val="Footer"/>
@@ -7174,13 +7409,13 @@
 </file>
 
 <file path=word/footer2.xml><?xml version="1.0" encoding="utf-8"?>
-<w:ftr xmlns:wpc="http://schemas.microsoft.com/office/word/2010/wordprocessingCanvas" xmlns:cx="http://schemas.microsoft.com/office/drawing/2014/chartex" xmlns:cx1="http://schemas.microsoft.com/office/drawing/2015/9/8/chartex" xmlns:cx2="http://schemas.microsoft.com/office/drawing/2015/10/21/chartex" xmlns:cx3="http://schemas.microsoft.com/office/drawing/2016/5/9/chartex" xmlns:cx4="http://schemas.microsoft.com/office/drawing/2016/5/10/chartex" xmlns:cx5="http://schemas.microsoft.com/office/drawing/2016/5/11/chartex" xmlns:cx6="http://schemas.microsoft.com/office/drawing/2016/5/12/chartex" xmlns:cx7="http://schemas.microsoft.com/office/drawing/2016/5/13/chartex" xmlns:cx8="http://schemas.microsoft.com/office/drawing/2016/5/14/chartex" xmlns:mc="http://schemas.openxmlformats.org/markup-compatibility/2006" xmlns:aink="http://schemas.microsoft.com/office/drawing/2016/ink" xmlns:am3d="http://schemas.microsoft.com/office/drawing/2017/model3d" xmlns:o="urn:schemas-microsoft-com:office:office" xmlns:oel="http://schemas.microsoft.com/office/2019/extlst" xmlns:r="http://schemas.openxmlformats.org/officeDocument/2006/relationships" xmlns:m="http://schemas.openxmlformats.org/officeDocument/2006/math" xmlns:v="urn:schemas-microsoft-com:vml" xmlns:wp14="http://schemas.microsoft.com/office/word/2010/wordprocessingDrawing" xmlns:wp="http://schemas.openxmlformats.org/drawingml/2006/wordprocessingDrawing" xmlns:w10="urn:schemas-microsoft-com:office:word" xmlns:w="http://schemas.openxmlformats.org/wordprocessingml/2006/main" xmlns:w14="http://schemas.microsoft.com/office/word/2010/wordml" xmlns:w15="http://schemas.microsoft.com/office/word/2012/wordml" xmlns:w16cex="http://schemas.microsoft.com/office/word/2018/wordml/cex" xmlns:w16cid="http://schemas.microsoft.com/office/word/2016/wordml/cid" xmlns:w16="http://schemas.microsoft.com/office/word/2018/wordml" xmlns:w16sdtdh="http://schemas.microsoft.com/office/word/2020/wordml/sdtdatahash" xmlns:w16se="http://schemas.microsoft.com/office/word/2015/wordml/symex" xmlns:wpg="http://schemas.microsoft.com/office/word/2010/wordprocessingGroup" xmlns:wpi="http://schemas.microsoft.com/office/word/2010/wordprocessingInk" xmlns:wne="http://schemas.microsoft.com/office/word/2006/wordml" xmlns:wps="http://schemas.microsoft.com/office/word/2010/wordprocessingShape" mc:Ignorable="w14 w15 w16se w16cid w16 w16cex w16sdtdh wp14">
+<w:ftr xmlns:wpc="http://schemas.microsoft.com/office/word/2010/wordprocessingCanvas" xmlns:cx="http://schemas.microsoft.com/office/drawing/2014/chartex" xmlns:cx1="http://schemas.microsoft.com/office/drawing/2015/9/8/chartex" xmlns:cx2="http://schemas.microsoft.com/office/drawing/2015/10/21/chartex" xmlns:cx3="http://schemas.microsoft.com/office/drawing/2016/5/9/chartex" xmlns:cx4="http://schemas.microsoft.com/office/drawing/2016/5/10/chartex" xmlns:cx5="http://schemas.microsoft.com/office/drawing/2016/5/11/chartex" xmlns:cx6="http://schemas.microsoft.com/office/drawing/2016/5/12/chartex" xmlns:cx7="http://schemas.microsoft.com/office/drawing/2016/5/13/chartex" xmlns:cx8="http://schemas.microsoft.com/office/drawing/2016/5/14/chartex" xmlns:mc="http://schemas.openxmlformats.org/markup-compatibility/2006" xmlns:aink="http://schemas.microsoft.com/office/drawing/2016/ink" xmlns:am3d="http://schemas.microsoft.com/office/drawing/2017/model3d" xmlns:o="urn:schemas-microsoft-com:office:office" xmlns:oel="http://schemas.microsoft.com/office/2019/extlst" xmlns:r="http://schemas.openxmlformats.org/officeDocument/2006/relationships" xmlns:m="http://schemas.openxmlformats.org/officeDocument/2006/math" xmlns:v="urn:schemas-microsoft-com:vml" xmlns:wp14="http://schemas.microsoft.com/office/word/2010/wordprocessingDrawing" xmlns:wp="http://schemas.openxmlformats.org/drawingml/2006/wordprocessingDrawing" xmlns:w10="urn:schemas-microsoft-com:office:word" xmlns:w="http://schemas.openxmlformats.org/wordprocessingml/2006/main" xmlns:w14="http://schemas.microsoft.com/office/word/2010/wordml" xmlns:w15="http://schemas.microsoft.com/office/word/2012/wordml" xmlns:w16cex="http://schemas.microsoft.com/office/word/2018/wordml/cex" xmlns:w16cid="http://schemas.microsoft.com/office/word/2016/wordml/cid" xmlns:w16="http://schemas.microsoft.com/office/word/2018/wordml" xmlns:w16du="http://schemas.microsoft.com/office/word/2023/wordml/word16du" xmlns:w16sdtdh="http://schemas.microsoft.com/office/word/2020/wordml/sdtdatahash" xmlns:w16sdtfl="http://schemas.microsoft.com/office/word/2024/wordml/sdtformatlock" xmlns:w16se="http://schemas.microsoft.com/office/word/2015/wordml/symex" xmlns:wpg="http://schemas.microsoft.com/office/word/2010/wordprocessingGroup" xmlns:wpi="http://schemas.microsoft.com/office/word/2010/wordprocessingInk" xmlns:wne="http://schemas.microsoft.com/office/word/2006/wordml" xmlns:wps="http://schemas.microsoft.com/office/word/2010/wordprocessingShape" mc:Ignorable="w14 w15 w16se w16cid w16 w16cex w16sdtdh w16sdtfl w16du wp14">
   <w:p/>
 </w:ftr>
 </file>
 
 <file path=word/footer3.xml><?xml version="1.0" encoding="utf-8"?>
-<w:ftr xmlns:wpc="http://schemas.microsoft.com/office/word/2010/wordprocessingCanvas" xmlns:cx="http://schemas.microsoft.com/office/drawing/2014/chartex" xmlns:cx1="http://schemas.microsoft.com/office/drawing/2015/9/8/chartex" xmlns:cx2="http://schemas.microsoft.com/office/drawing/2015/10/21/chartex" xmlns:cx3="http://schemas.microsoft.com/office/drawing/2016/5/9/chartex" xmlns:cx4="http://schemas.microsoft.com/office/drawing/2016/5/10/chartex" xmlns:cx5="http://schemas.microsoft.com/office/drawing/2016/5/11/chartex" xmlns:cx6="http://schemas.microsoft.com/office/drawing/2016/5/12/chartex" xmlns:cx7="http://schemas.microsoft.com/office/drawing/2016/5/13/chartex" xmlns:cx8="http://schemas.microsoft.com/office/drawing/2016/5/14/chartex" xmlns:mc="http://schemas.openxmlformats.org/markup-compatibility/2006" xmlns:aink="http://schemas.microsoft.com/office/drawing/2016/ink" xmlns:am3d="http://schemas.microsoft.com/office/drawing/2017/model3d" xmlns:o="urn:schemas-microsoft-com:office:office" xmlns:oel="http://schemas.microsoft.com/office/2019/extlst" xmlns:r="http://schemas.openxmlformats.org/officeDocument/2006/relationships" xmlns:m="http://schemas.openxmlformats.org/officeDocument/2006/math" xmlns:v="urn:schemas-microsoft-com:vml" xmlns:wp14="http://schemas.microsoft.com/office/word/2010/wordprocessingDrawing" xmlns:wp="http://schemas.openxmlformats.org/drawingml/2006/wordprocessingDrawing" xmlns:w10="urn:schemas-microsoft-com:office:word" xmlns:w="http://schemas.openxmlformats.org/wordprocessingml/2006/main" xmlns:w14="http://schemas.microsoft.com/office/word/2010/wordml" xmlns:w15="http://schemas.microsoft.com/office/word/2012/wordml" xmlns:w16cex="http://schemas.microsoft.com/office/word/2018/wordml/cex" xmlns:w16cid="http://schemas.microsoft.com/office/word/2016/wordml/cid" xmlns:w16="http://schemas.microsoft.com/office/word/2018/wordml" xmlns:w16sdtdh="http://schemas.microsoft.com/office/word/2020/wordml/sdtdatahash" xmlns:w16se="http://schemas.microsoft.com/office/word/2015/wordml/symex" xmlns:wpg="http://schemas.microsoft.com/office/word/2010/wordprocessingGroup" xmlns:wpi="http://schemas.microsoft.com/office/word/2010/wordprocessingInk" xmlns:wne="http://schemas.microsoft.com/office/word/2006/wordml" xmlns:wps="http://schemas.microsoft.com/office/word/2010/wordprocessingShape" mc:Ignorable="w14 w15 w16se w16cid w16 w16cex w16sdtdh wp14">
+<w:ftr xmlns:wpc="http://schemas.microsoft.com/office/word/2010/wordprocessingCanvas" xmlns:cx="http://schemas.microsoft.com/office/drawing/2014/chartex" xmlns:cx1="http://schemas.microsoft.com/office/drawing/2015/9/8/chartex" xmlns:cx2="http://schemas.microsoft.com/office/drawing/2015/10/21/chartex" xmlns:cx3="http://schemas.microsoft.com/office/drawing/2016/5/9/chartex" xmlns:cx4="http://schemas.microsoft.com/office/drawing/2016/5/10/chartex" xmlns:cx5="http://schemas.microsoft.com/office/drawing/2016/5/11/chartex" xmlns:cx6="http://schemas.microsoft.com/office/drawing/2016/5/12/chartex" xmlns:cx7="http://schemas.microsoft.com/office/drawing/2016/5/13/chartex" xmlns:cx8="http://schemas.microsoft.com/office/drawing/2016/5/14/chartex" xmlns:mc="http://schemas.openxmlformats.org/markup-compatibility/2006" xmlns:aink="http://schemas.microsoft.com/office/drawing/2016/ink" xmlns:am3d="http://schemas.microsoft.com/office/drawing/2017/model3d" xmlns:o="urn:schemas-microsoft-com:office:office" xmlns:oel="http://schemas.microsoft.com/office/2019/extlst" xmlns:r="http://schemas.openxmlformats.org/officeDocument/2006/relationships" xmlns:m="http://schemas.openxmlformats.org/officeDocument/2006/math" xmlns:v="urn:schemas-microsoft-com:vml" xmlns:wp14="http://schemas.microsoft.com/office/word/2010/wordprocessingDrawing" xmlns:wp="http://schemas.openxmlformats.org/drawingml/2006/wordprocessingDrawing" xmlns:w10="urn:schemas-microsoft-com:office:word" xmlns:w="http://schemas.openxmlformats.org/wordprocessingml/2006/main" xmlns:w14="http://schemas.microsoft.com/office/word/2010/wordml" xmlns:w15="http://schemas.microsoft.com/office/word/2012/wordml" xmlns:w16cex="http://schemas.microsoft.com/office/word/2018/wordml/cex" xmlns:w16cid="http://schemas.microsoft.com/office/word/2016/wordml/cid" xmlns:w16="http://schemas.microsoft.com/office/word/2018/wordml" xmlns:w16du="http://schemas.microsoft.com/office/word/2023/wordml/word16du" xmlns:w16sdtdh="http://schemas.microsoft.com/office/word/2020/wordml/sdtdatahash" xmlns:w16sdtfl="http://schemas.microsoft.com/office/word/2024/wordml/sdtformatlock" xmlns:w16se="http://schemas.microsoft.com/office/word/2015/wordml/symex" xmlns:wpg="http://schemas.microsoft.com/office/word/2010/wordprocessingGroup" xmlns:wpi="http://schemas.microsoft.com/office/word/2010/wordprocessingInk" xmlns:wne="http://schemas.microsoft.com/office/word/2006/wordml" xmlns:wps="http://schemas.microsoft.com/office/word/2010/wordprocessingShape" mc:Ignorable="w14 w15 w16se w16cid w16 w16cex w16sdtdh w16sdtfl w16du wp14">
   <w:p>
     <w:pPr>
       <w:pStyle w:val="Footer"/>
@@ -7190,7 +7425,7 @@
 </file>
 
 <file path=word/footnotes.xml><?xml version="1.0" encoding="utf-8"?>
-<w:footnotes xmlns:wpc="http://schemas.microsoft.com/office/word/2010/wordprocessingCanvas" xmlns:cx="http://schemas.microsoft.com/office/drawing/2014/chartex" xmlns:cx1="http://schemas.microsoft.com/office/drawing/2015/9/8/chartex" xmlns:cx2="http://schemas.microsoft.com/office/drawing/2015/10/21/chartex" xmlns:cx3="http://schemas.microsoft.com/office/drawing/2016/5/9/chartex" xmlns:cx4="http://schemas.microsoft.com/office/drawing/2016/5/10/chartex" xmlns:cx5="http://schemas.microsoft.com/office/drawing/2016/5/11/chartex" xmlns:cx6="http://schemas.microsoft.com/office/drawing/2016/5/12/chartex" xmlns:cx7="http://schemas.microsoft.com/office/drawing/2016/5/13/chartex" xmlns:cx8="http://schemas.microsoft.com/office/drawing/2016/5/14/chartex" xmlns:mc="http://schemas.openxmlformats.org/markup-compatibility/2006" xmlns:aink="http://schemas.microsoft.com/office/drawing/2016/ink" xmlns:am3d="http://schemas.microsoft.com/office/drawing/2017/model3d" xmlns:o="urn:schemas-microsoft-com:office:office" xmlns:oel="http://schemas.microsoft.com/office/2019/extlst" xmlns:r="http://schemas.openxmlformats.org/officeDocument/2006/relationships" xmlns:m="http://schemas.openxmlformats.org/officeDocument/2006/math" xmlns:v="urn:schemas-microsoft-com:vml" xmlns:wp14="http://schemas.microsoft.com/office/word/2010/wordprocessingDrawing" xmlns:wp="http://schemas.openxmlformats.org/drawingml/2006/wordprocessingDrawing" xmlns:w10="urn:schemas-microsoft-com:office:word" xmlns:w="http://schemas.openxmlformats.org/wordprocessingml/2006/main" xmlns:w14="http://schemas.microsoft.com/office/word/2010/wordml" xmlns:w15="http://schemas.microsoft.com/office/word/2012/wordml" xmlns:w16cex="http://schemas.microsoft.com/office/word/2018/wordml/cex" xmlns:w16cid="http://schemas.microsoft.com/office/word/2016/wordml/cid" xmlns:w16="http://schemas.microsoft.com/office/word/2018/wordml" xmlns:w16sdtdh="http://schemas.microsoft.com/office/word/2020/wordml/sdtdatahash" xmlns:w16se="http://schemas.microsoft.com/office/word/2015/wordml/symex" xmlns:wpg="http://schemas.microsoft.com/office/word/2010/wordprocessingGroup" xmlns:wpi="http://schemas.microsoft.com/office/word/2010/wordprocessingInk" xmlns:wne="http://schemas.microsoft.com/office/word/2006/wordml" xmlns:wps="http://schemas.microsoft.com/office/word/2010/wordprocessingShape" mc:Ignorable="w14 w15 w16se w16cid w16 w16cex w16sdtdh wp14">
+<w:footnotes xmlns:wpc="http://schemas.microsoft.com/office/word/2010/wordprocessingCanvas" xmlns:cx="http://schemas.microsoft.com/office/drawing/2014/chartex" xmlns:cx1="http://schemas.microsoft.com/office/drawing/2015/9/8/chartex" xmlns:cx2="http://schemas.microsoft.com/office/drawing/2015/10/21/chartex" xmlns:cx3="http://schemas.microsoft.com/office/drawing/2016/5/9/chartex" xmlns:cx4="http://schemas.microsoft.com/office/drawing/2016/5/10/chartex" xmlns:cx5="http://schemas.microsoft.com/office/drawing/2016/5/11/chartex" xmlns:cx6="http://schemas.microsoft.com/office/drawing/2016/5/12/chartex" xmlns:cx7="http://schemas.microsoft.com/office/drawing/2016/5/13/chartex" xmlns:cx8="http://schemas.microsoft.com/office/drawing/2016/5/14/chartex" xmlns:mc="http://schemas.openxmlformats.org/markup-compatibility/2006" xmlns:aink="http://schemas.microsoft.com/office/drawing/2016/ink" xmlns:am3d="http://schemas.microsoft.com/office/drawing/2017/model3d" xmlns:o="urn:schemas-microsoft-com:office:office" xmlns:oel="http://schemas.microsoft.com/office/2019/extlst" xmlns:r="http://schemas.openxmlformats.org/officeDocument/2006/relationships" xmlns:m="http://schemas.openxmlformats.org/officeDocument/2006/math" xmlns:v="urn:schemas-microsoft-com:vml" xmlns:wp14="http://schemas.microsoft.com/office/word/2010/wordprocessingDrawing" xmlns:wp="http://schemas.openxmlformats.org/drawingml/2006/wordprocessingDrawing" xmlns:w10="urn:schemas-microsoft-com:office:word" xmlns:w="http://schemas.openxmlformats.org/wordprocessingml/2006/main" xmlns:w14="http://schemas.microsoft.com/office/word/2010/wordml" xmlns:w15="http://schemas.microsoft.com/office/word/2012/wordml" xmlns:w16cex="http://schemas.microsoft.com/office/word/2018/wordml/cex" xmlns:w16cid="http://schemas.microsoft.com/office/word/2016/wordml/cid" xmlns:w16="http://schemas.microsoft.com/office/word/2018/wordml" xmlns:w16du="http://schemas.microsoft.com/office/word/2023/wordml/word16du" xmlns:w16sdtdh="http://schemas.microsoft.com/office/word/2020/wordml/sdtdatahash" xmlns:w16sdtfl="http://schemas.microsoft.com/office/word/2024/wordml/sdtformatlock" xmlns:w16se="http://schemas.microsoft.com/office/word/2015/wordml/symex" xmlns:wpg="http://schemas.microsoft.com/office/word/2010/wordprocessingGroup" xmlns:wpi="http://schemas.microsoft.com/office/word/2010/wordprocessingInk" xmlns:wne="http://schemas.microsoft.com/office/word/2006/wordml" xmlns:wps="http://schemas.microsoft.com/office/word/2010/wordprocessingShape" mc:Ignorable="w14 w15 w16se w16cid w16 w16cex w16sdtdh w16sdtfl w16du wp14">
   <w:footnote w:type="separator" w:id="-1">
     <w:p>
       <w:r>
@@ -7209,7 +7444,7 @@
 </file>
 
 <file path=word/header1.xml><?xml version="1.0" encoding="utf-8"?>
-<w:hdr xmlns:wpc="http://schemas.microsoft.com/office/word/2010/wordprocessingCanvas" xmlns:cx="http://schemas.microsoft.com/office/drawing/2014/chartex" xmlns:cx1="http://schemas.microsoft.com/office/drawing/2015/9/8/chartex" xmlns:cx2="http://schemas.microsoft.com/office/drawing/2015/10/21/chartex" xmlns:cx3="http://schemas.microsoft.com/office/drawing/2016/5/9/chartex" xmlns:cx4="http://schemas.microsoft.com/office/drawing/2016/5/10/chartex" xmlns:cx5="http://schemas.microsoft.com/office/drawing/2016/5/11/chartex" xmlns:cx6="http://schemas.microsoft.com/office/drawing/2016/5/12/chartex" xmlns:cx7="http://schemas.microsoft.com/office/drawing/2016/5/13/chartex" xmlns:cx8="http://schemas.microsoft.com/office/drawing/2016/5/14/chartex" xmlns:mc="http://schemas.openxmlformats.org/markup-compatibility/2006" xmlns:aink="http://schemas.microsoft.com/office/drawing/2016/ink" xmlns:am3d="http://schemas.microsoft.com/office/drawing/2017/model3d" xmlns:o="urn:schemas-microsoft-com:office:office" xmlns:oel="http://schemas.microsoft.com/office/2019/extlst" xmlns:r="http://schemas.openxmlformats.org/officeDocument/2006/relationships" xmlns:m="http://schemas.openxmlformats.org/officeDocument/2006/math" xmlns:v="urn:schemas-microsoft-com:vml" xmlns:wp14="http://schemas.microsoft.com/office/word/2010/wordprocessingDrawing" xmlns:wp="http://schemas.openxmlformats.org/drawingml/2006/wordprocessingDrawing" xmlns:w10="urn:schemas-microsoft-com:office:word" xmlns:w="http://schemas.openxmlformats.org/wordprocessingml/2006/main" xmlns:w14="http://schemas.microsoft.com/office/word/2010/wordml" xmlns:w15="http://schemas.microsoft.com/office/word/2012/wordml" xmlns:w16cex="http://schemas.microsoft.com/office/word/2018/wordml/cex" xmlns:w16cid="http://schemas.microsoft.com/office/word/2016/wordml/cid" xmlns:w16="http://schemas.microsoft.com/office/word/2018/wordml" xmlns:w16sdtdh="http://schemas.microsoft.com/office/word/2020/wordml/sdtdatahash" xmlns:w16se="http://schemas.microsoft.com/office/word/2015/wordml/symex" xmlns:wpg="http://schemas.microsoft.com/office/word/2010/wordprocessingGroup" xmlns:wpi="http://schemas.microsoft.com/office/word/2010/wordprocessingInk" xmlns:wne="http://schemas.microsoft.com/office/word/2006/wordml" xmlns:wps="http://schemas.microsoft.com/office/word/2010/wordprocessingShape" mc:Ignorable="w14 w15 w16se w16cid w16 w16cex w16sdtdh wp14">
+<w:hdr xmlns:wpc="http://schemas.microsoft.com/office/word/2010/wordprocessingCanvas" xmlns:cx="http://schemas.microsoft.com/office/drawing/2014/chartex" xmlns:cx1="http://schemas.microsoft.com/office/drawing/2015/9/8/chartex" xmlns:cx2="http://schemas.microsoft.com/office/drawing/2015/10/21/chartex" xmlns:cx3="http://schemas.microsoft.com/office/drawing/2016/5/9/chartex" xmlns:cx4="http://schemas.microsoft.com/office/drawing/2016/5/10/chartex" xmlns:cx5="http://schemas.microsoft.com/office/drawing/2016/5/11/chartex" xmlns:cx6="http://schemas.microsoft.com/office/drawing/2016/5/12/chartex" xmlns:cx7="http://schemas.microsoft.com/office/drawing/2016/5/13/chartex" xmlns:cx8="http://schemas.microsoft.com/office/drawing/2016/5/14/chartex" xmlns:mc="http://schemas.openxmlformats.org/markup-compatibility/2006" xmlns:aink="http://schemas.microsoft.com/office/drawing/2016/ink" xmlns:am3d="http://schemas.microsoft.com/office/drawing/2017/model3d" xmlns:o="urn:schemas-microsoft-com:office:office" xmlns:oel="http://schemas.microsoft.com/office/2019/extlst" xmlns:r="http://schemas.openxmlformats.org/officeDocument/2006/relationships" xmlns:m="http://schemas.openxmlformats.org/officeDocument/2006/math" xmlns:v="urn:schemas-microsoft-com:vml" xmlns:wp14="http://schemas.microsoft.com/office/word/2010/wordprocessingDrawing" xmlns:wp="http://schemas.openxmlformats.org/drawingml/2006/wordprocessingDrawing" xmlns:w10="urn:schemas-microsoft-com:office:word" xmlns:w="http://schemas.openxmlformats.org/wordprocessingml/2006/main" xmlns:w14="http://schemas.microsoft.com/office/word/2010/wordml" xmlns:w15="http://schemas.microsoft.com/office/word/2012/wordml" xmlns:w16cex="http://schemas.microsoft.com/office/word/2018/wordml/cex" xmlns:w16cid="http://schemas.microsoft.com/office/word/2016/wordml/cid" xmlns:w16="http://schemas.microsoft.com/office/word/2018/wordml" xmlns:w16du="http://schemas.microsoft.com/office/word/2023/wordml/word16du" xmlns:w16sdtdh="http://schemas.microsoft.com/office/word/2020/wordml/sdtdatahash" xmlns:w16sdtfl="http://schemas.microsoft.com/office/word/2024/wordml/sdtformatlock" xmlns:w16se="http://schemas.microsoft.com/office/word/2015/wordml/symex" xmlns:wpg="http://schemas.microsoft.com/office/word/2010/wordprocessingGroup" xmlns:wpi="http://schemas.microsoft.com/office/word/2010/wordprocessingInk" xmlns:wne="http://schemas.microsoft.com/office/word/2006/wordml" xmlns:wps="http://schemas.microsoft.com/office/word/2010/wordprocessingShape" mc:Ignorable="w14 w15 w16se w16cid w16 w16cex w16sdtdh w16sdtfl w16du wp14">
   <w:p>
     <w:pPr>
       <w:pStyle w:val="Header"/>
@@ -7219,7 +7454,7 @@
 </file>
 
 <file path=word/header2.xml><?xml version="1.0" encoding="utf-8"?>
-<w:hdr xmlns:wpc="http://schemas.microsoft.com/office/word/2010/wordprocessingCanvas" xmlns:cx="http://schemas.microsoft.com/office/drawing/2014/chartex" xmlns:cx1="http://schemas.microsoft.com/office/drawing/2015/9/8/chartex" xmlns:cx2="http://schemas.microsoft.com/office/drawing/2015/10/21/chartex" xmlns:cx3="http://schemas.microsoft.com/office/drawing/2016/5/9/chartex" xmlns:cx4="http://schemas.microsoft.com/office/drawing/2016/5/10/chartex" xmlns:cx5="http://schemas.microsoft.com/office/drawing/2016/5/11/chartex" xmlns:cx6="http://schemas.microsoft.com/office/drawing/2016/5/12/chartex" xmlns:cx7="http://schemas.microsoft.com/office/drawing/2016/5/13/chartex" xmlns:cx8="http://schemas.microsoft.com/office/drawing/2016/5/14/chartex" xmlns:mc="http://schemas.openxmlformats.org/markup-compatibility/2006" xmlns:aink="http://schemas.microsoft.com/office/drawing/2016/ink" xmlns:am3d="http://schemas.microsoft.com/office/drawing/2017/model3d" xmlns:o="urn:schemas-microsoft-com:office:office" xmlns:oel="http://schemas.microsoft.com/office/2019/extlst" xmlns:r="http://schemas.openxmlformats.org/officeDocument/2006/relationships" xmlns:m="http://schemas.openxmlformats.org/officeDocument/2006/math" xmlns:v="urn:schemas-microsoft-com:vml" xmlns:wp14="http://schemas.microsoft.com/office/word/2010/wordprocessingDrawing" xmlns:wp="http://schemas.openxmlformats.org/drawingml/2006/wordprocessingDrawing" xmlns:w10="urn:schemas-microsoft-com:office:word" xmlns:w="http://schemas.openxmlformats.org/wordprocessingml/2006/main" xmlns:w14="http://schemas.microsoft.com/office/word/2010/wordml" xmlns:w15="http://schemas.microsoft.com/office/word/2012/wordml" xmlns:w16cex="http://schemas.microsoft.com/office/word/2018/wordml/cex" xmlns:w16cid="http://schemas.microsoft.com/office/word/2016/wordml/cid" xmlns:w16="http://schemas.microsoft.com/office/word/2018/wordml" xmlns:w16sdtdh="http://schemas.microsoft.com/office/word/2020/wordml/sdtdatahash" xmlns:w16se="http://schemas.microsoft.com/office/word/2015/wordml/symex" xmlns:wpg="http://schemas.microsoft.com/office/word/2010/wordprocessingGroup" xmlns:wpi="http://schemas.microsoft.com/office/word/2010/wordprocessingInk" xmlns:wne="http://schemas.microsoft.com/office/word/2006/wordml" xmlns:wps="http://schemas.microsoft.com/office/word/2010/wordprocessingShape" mc:Ignorable="w14 w15 w16se w16cid w16 w16cex w16sdtdh wp14">
+<w:hdr xmlns:wpc="http://schemas.microsoft.com/office/word/2010/wordprocessingCanvas" xmlns:cx="http://schemas.microsoft.com/office/drawing/2014/chartex" xmlns:cx1="http://schemas.microsoft.com/office/drawing/2015/9/8/chartex" xmlns:cx2="http://schemas.microsoft.com/office/drawing/2015/10/21/chartex" xmlns:cx3="http://schemas.microsoft.com/office/drawing/2016/5/9/chartex" xmlns:cx4="http://schemas.microsoft.com/office/drawing/2016/5/10/chartex" xmlns:cx5="http://schemas.microsoft.com/office/drawing/2016/5/11/chartex" xmlns:cx6="http://schemas.microsoft.com/office/drawing/2016/5/12/chartex" xmlns:cx7="http://schemas.microsoft.com/office/drawing/2016/5/13/chartex" xmlns:cx8="http://schemas.microsoft.com/office/drawing/2016/5/14/chartex" xmlns:mc="http://schemas.openxmlformats.org/markup-compatibility/2006" xmlns:aink="http://schemas.microsoft.com/office/drawing/2016/ink" xmlns:am3d="http://schemas.microsoft.com/office/drawing/2017/model3d" xmlns:o="urn:schemas-microsoft-com:office:office" xmlns:oel="http://schemas.microsoft.com/office/2019/extlst" xmlns:r="http://schemas.openxmlformats.org/officeDocument/2006/relationships" xmlns:m="http://schemas.openxmlformats.org/officeDocument/2006/math" xmlns:v="urn:schemas-microsoft-com:vml" xmlns:wp14="http://schemas.microsoft.com/office/word/2010/wordprocessingDrawing" xmlns:wp="http://schemas.openxmlformats.org/drawingml/2006/wordprocessingDrawing" xmlns:w10="urn:schemas-microsoft-com:office:word" xmlns:w="http://schemas.openxmlformats.org/wordprocessingml/2006/main" xmlns:w14="http://schemas.microsoft.com/office/word/2010/wordml" xmlns:w15="http://schemas.microsoft.com/office/word/2012/wordml" xmlns:w16cex="http://schemas.microsoft.com/office/word/2018/wordml/cex" xmlns:w16cid="http://schemas.microsoft.com/office/word/2016/wordml/cid" xmlns:w16="http://schemas.microsoft.com/office/word/2018/wordml" xmlns:w16du="http://schemas.microsoft.com/office/word/2023/wordml/word16du" xmlns:w16sdtdh="http://schemas.microsoft.com/office/word/2020/wordml/sdtdatahash" xmlns:w16sdtfl="http://schemas.microsoft.com/office/word/2024/wordml/sdtformatlock" xmlns:w16se="http://schemas.microsoft.com/office/word/2015/wordml/symex" xmlns:wpg="http://schemas.microsoft.com/office/word/2010/wordprocessingGroup" xmlns:wpi="http://schemas.microsoft.com/office/word/2010/wordprocessingInk" xmlns:wne="http://schemas.microsoft.com/office/word/2006/wordml" xmlns:wps="http://schemas.microsoft.com/office/word/2010/wordprocessingShape" mc:Ignorable="w14 w15 w16se w16cid w16 w16cex w16sdtdh w16sdtfl w16du wp14">
   <w:p>
     <w:pPr>
       <w:jc w:val="center"/>
@@ -7229,7 +7464,7 @@
 </file>
 
 <file path=word/header3.xml><?xml version="1.0" encoding="utf-8"?>
-<w:hdr xmlns:wpc="http://schemas.microsoft.com/office/word/2010/wordprocessingCanvas" xmlns:cx="http://schemas.microsoft.com/office/drawing/2014/chartex" xmlns:cx1="http://schemas.microsoft.com/office/drawing/2015/9/8/chartex" xmlns:cx2="http://schemas.microsoft.com/office/drawing/2015/10/21/chartex" xmlns:cx3="http://schemas.microsoft.com/office/drawing/2016/5/9/chartex" xmlns:cx4="http://schemas.microsoft.com/office/drawing/2016/5/10/chartex" xmlns:cx5="http://schemas.microsoft.com/office/drawing/2016/5/11/chartex" xmlns:cx6="http://schemas.microsoft.com/office/drawing/2016/5/12/chartex" xmlns:cx7="http://schemas.microsoft.com/office/drawing/2016/5/13/chartex" xmlns:cx8="http://schemas.microsoft.com/office/drawing/2016/5/14/chartex" xmlns:mc="http://schemas.openxmlformats.org/markup-compatibility/2006" xmlns:aink="http://schemas.microsoft.com/office/drawing/2016/ink" xmlns:am3d="http://schemas.microsoft.com/office/drawing/2017/model3d" xmlns:o="urn:schemas-microsoft-com:office:office" xmlns:oel="http://schemas.microsoft.com/office/2019/extlst" xmlns:r="http://schemas.openxmlformats.org/officeDocument/2006/relationships" xmlns:m="http://schemas.openxmlformats.org/officeDocument/2006/math" xmlns:v="urn:schemas-microsoft-com:vml" xmlns:wp14="http://schemas.microsoft.com/office/word/2010/wordprocessingDrawing" xmlns:wp="http://schemas.openxmlformats.org/drawingml/2006/wordprocessingDrawing" xmlns:w10="urn:schemas-microsoft-com:office:word" xmlns:w="http://schemas.openxmlformats.org/wordprocessingml/2006/main" xmlns:w14="http://schemas.microsoft.com/office/word/2010/wordml" xmlns:w15="http://schemas.microsoft.com/office/word/2012/wordml" xmlns:w16cex="http://schemas.microsoft.com/office/word/2018/wordml/cex" xmlns:w16cid="http://schemas.microsoft.com/office/word/2016/wordml/cid" xmlns:w16="http://schemas.microsoft.com/office/word/2018/wordml" xmlns:w16sdtdh="http://schemas.microsoft.com/office/word/2020/wordml/sdtdatahash" xmlns:w16se="http://schemas.microsoft.com/office/word/2015/wordml/symex" xmlns:wpg="http://schemas.microsoft.com/office/word/2010/wordprocessingGroup" xmlns:wpi="http://schemas.microsoft.com/office/word/2010/wordprocessingInk" xmlns:wne="http://schemas.microsoft.com/office/word/2006/wordml" xmlns:wps="http://schemas.microsoft.com/office/word/2010/wordprocessingShape" mc:Ignorable="w14 w15 w16se w16cid w16 w16cex w16sdtdh wp14">
+<w:hdr xmlns:wpc="http://schemas.microsoft.com/office/word/2010/wordprocessingCanvas" xmlns:cx="http://schemas.microsoft.com/office/drawing/2014/chartex" xmlns:cx1="http://schemas.microsoft.com/office/drawing/2015/9/8/chartex" xmlns:cx2="http://schemas.microsoft.com/office/drawing/2015/10/21/chartex" xmlns:cx3="http://schemas.microsoft.com/office/drawing/2016/5/9/chartex" xmlns:cx4="http://schemas.microsoft.com/office/drawing/2016/5/10/chartex" xmlns:cx5="http://schemas.microsoft.com/office/drawing/2016/5/11/chartex" xmlns:cx6="http://schemas.microsoft.com/office/drawing/2016/5/12/chartex" xmlns:cx7="http://schemas.microsoft.com/office/drawing/2016/5/13/chartex" xmlns:cx8="http://schemas.microsoft.com/office/drawing/2016/5/14/chartex" xmlns:mc="http://schemas.openxmlformats.org/markup-compatibility/2006" xmlns:aink="http://schemas.microsoft.com/office/drawing/2016/ink" xmlns:am3d="http://schemas.microsoft.com/office/drawing/2017/model3d" xmlns:o="urn:schemas-microsoft-com:office:office" xmlns:oel="http://schemas.microsoft.com/office/2019/extlst" xmlns:r="http://schemas.openxmlformats.org/officeDocument/2006/relationships" xmlns:m="http://schemas.openxmlformats.org/officeDocument/2006/math" xmlns:v="urn:schemas-microsoft-com:vml" xmlns:wp14="http://schemas.microsoft.com/office/word/2010/wordprocessingDrawing" xmlns:wp="http://schemas.openxmlformats.org/drawingml/2006/wordprocessingDrawing" xmlns:w10="urn:schemas-microsoft-com:office:word" xmlns:w="http://schemas.openxmlformats.org/wordprocessingml/2006/main" xmlns:w14="http://schemas.microsoft.com/office/word/2010/wordml" xmlns:w15="http://schemas.microsoft.com/office/word/2012/wordml" xmlns:w16cex="http://schemas.microsoft.com/office/word/2018/wordml/cex" xmlns:w16cid="http://schemas.microsoft.com/office/word/2016/wordml/cid" xmlns:w16="http://schemas.microsoft.com/office/word/2018/wordml" xmlns:w16du="http://schemas.microsoft.com/office/word/2023/wordml/word16du" xmlns:w16sdtdh="http://schemas.microsoft.com/office/word/2020/wordml/sdtdatahash" xmlns:w16sdtfl="http://schemas.microsoft.com/office/word/2024/wordml/sdtformatlock" xmlns:w16se="http://schemas.microsoft.com/office/word/2015/wordml/symex" xmlns:wpg="http://schemas.microsoft.com/office/word/2010/wordprocessingGroup" xmlns:wpi="http://schemas.microsoft.com/office/word/2010/wordprocessingInk" xmlns:wne="http://schemas.microsoft.com/office/word/2006/wordml" xmlns:wps="http://schemas.microsoft.com/office/word/2010/wordprocessingShape" mc:Ignorable="w14 w15 w16se w16cid w16 w16cex w16sdtdh w16sdtfl w16du wp14">
   <w:p>
     <w:pPr>
       <w:pStyle w:val="Header"/>
@@ -7239,7 +7474,7 @@
 </file>
 
 <file path=word/styles.xml><?xml version="1.0" encoding="utf-8"?>
-<w:styles xmlns:mc="http://schemas.openxmlformats.org/markup-compatibility/2006" xmlns:r="http://schemas.openxmlformats.org/officeDocument/2006/relationships" xmlns:w="http://schemas.openxmlformats.org/wordprocessingml/2006/main" xmlns:w14="http://schemas.microsoft.com/office/word/2010/wordml" xmlns:w15="http://schemas.microsoft.com/office/word/2012/wordml" xmlns:w16cex="http://schemas.microsoft.com/office/word/2018/wordml/cex" xmlns:w16cid="http://schemas.microsoft.com/office/word/2016/wordml/cid" xmlns:w16="http://schemas.microsoft.com/office/word/2018/wordml" xmlns:w16sdtdh="http://schemas.microsoft.com/office/word/2020/wordml/sdtdatahash" xmlns:w16se="http://schemas.microsoft.com/office/word/2015/wordml/symex" mc:Ignorable="w14 w15 w16se w16cid w16 w16cex w16sdtdh">
+<w:styles xmlns:mc="http://schemas.openxmlformats.org/markup-compatibility/2006" xmlns:r="http://schemas.openxmlformats.org/officeDocument/2006/relationships" xmlns:w="http://schemas.openxmlformats.org/wordprocessingml/2006/main" xmlns:w14="http://schemas.microsoft.com/office/word/2010/wordml" xmlns:w15="http://schemas.microsoft.com/office/word/2012/wordml" xmlns:w16cex="http://schemas.microsoft.com/office/word/2018/wordml/cex" xmlns:w16cid="http://schemas.microsoft.com/office/word/2016/wordml/cid" xmlns:w16="http://schemas.microsoft.com/office/word/2018/wordml" xmlns:w16du="http://schemas.microsoft.com/office/word/2023/wordml/word16du" xmlns:w16sdtdh="http://schemas.microsoft.com/office/word/2020/wordml/sdtdatahash" xmlns:w16sdtfl="http://schemas.microsoft.com/office/word/2024/wordml/sdtformatlock" xmlns:w16se="http://schemas.microsoft.com/office/word/2015/wordml/symex" mc:Ignorable="w14 w15 w16se w16cid w16 w16cex w16sdtdh w16sdtfl w16du">
   <w:docDefaults>
     <w:rPrDefault>
       <w:rPr>

</xml_diff>